<commit_message>
Update BP CPU/GPU comparison report and meeting document
</commit_message>
<xml_diff>
--- a/组会/9.19组会_黑白表格.docx
+++ b/组会/9.19组会_黑白表格.docx
@@ -4,56 +4,87 @@
   <w:body>
     <w:p>
       <w:pPr>
-        <w:pStyle w:val="31"/>
-        <w:ind w:firstLine="3442" w:firstLineChars="800"/>
-        <w:jc w:val="both"/>
+        <w:pStyle w:val="3"/>
+        <w:keepNext/>
+        <w:keepLines/>
+        <w:jc w:val="center"/>
+        <w:rPr>
+          <w:rFonts w:hint="eastAsia" w:ascii="宋体" w:hAnsi="宋体" w:eastAsia="宋体" w:cs="宋体"/>
+          <w:b/>
+          <w:color w:val="000000"/>
+          <w:sz w:val="44"/>
+          <w:szCs w:val="44"/>
+          <w:lang w:val="en-US" w:eastAsia="zh-CN"/>
+        </w:rPr>
       </w:pPr>
       <w:r>
         <w:rPr>
-          <w:rFonts w:ascii="微软雅黑" w:hAnsi="微软雅黑" w:eastAsia="微软雅黑"/>
+          <w:rFonts w:hint="eastAsia" w:ascii="宋体" w:hAnsi="宋体" w:eastAsia="宋体" w:cs="宋体"/>
           <w:b/>
           <w:color w:val="000000"/>
-          <w:sz w:val="42"/>
+          <w:sz w:val="44"/>
+          <w:szCs w:val="44"/>
         </w:rPr>
-        <w:t>2026</w:t>
+        <w:t>BP</w:t>
       </w:r>
       <w:r>
         <w:rPr>
-          <w:rFonts w:hint="eastAsia" w:ascii="微软雅黑" w:hAnsi="微软雅黑" w:eastAsia="微软雅黑"/>
+          <w:rFonts w:hint="eastAsia" w:ascii="宋体" w:hAnsi="宋体" w:eastAsia="宋体" w:cs="宋体"/>
           <w:b/>
           <w:color w:val="000000"/>
-          <w:sz w:val="42"/>
-          <w:lang w:eastAsia="zh-CN"/>
+          <w:sz w:val="44"/>
+          <w:szCs w:val="44"/>
+          <w:lang w:val="en-US" w:eastAsia="zh-CN"/>
         </w:rPr>
-        <w:t>.</w:t>
+        <w:t>算法在cpu和gpu上的成像效果对比</w:t>
+      </w:r>
+    </w:p>
+    <w:p>
+      <w:pPr>
+        <w:keepLines/>
+        <w:ind w:firstLine="420" w:firstLineChars="200"/>
+      </w:pPr>
+      <w:r>
+        <w:rPr>
+          <w:rFonts w:ascii="宋体" w:hAnsi="宋体" w:eastAsia="宋体"/>
+          <w:color w:val="000000"/>
+          <w:sz w:val="21"/>
+        </w:rPr>
+        <w:t>本次</w:t>
       </w:r>
       <w:r>
         <w:rPr>
-          <w:rFonts w:ascii="微软雅黑" w:hAnsi="微软雅黑" w:eastAsia="微软雅黑"/>
-          <w:b/>
+          <w:rFonts w:hint="eastAsia"/>
           <w:color w:val="000000"/>
-          <w:sz w:val="42"/>
+          <w:sz w:val="21"/>
+          <w:lang w:val="en-US" w:eastAsia="zh-CN"/>
         </w:rPr>
-        <w:t>9</w:t>
+        <w:t>实验</w:t>
       </w:r>
       <w:r>
         <w:rPr>
-          <w:rFonts w:hint="eastAsia" w:ascii="微软雅黑" w:hAnsi="微软雅黑" w:eastAsia="微软雅黑"/>
-          <w:b/>
+          <w:rFonts w:ascii="宋体" w:hAnsi="宋体" w:eastAsia="宋体"/>
           <w:color w:val="000000"/>
-          <w:sz w:val="42"/>
-          <w:lang w:val="en-US" w:eastAsia="zh-CN"/>
+          <w:sz w:val="21"/>
         </w:rPr>
-        <w:t>.1</w:t>
+        <w:t>比较</w:t>
       </w:r>
       <w:r>
         <w:rPr>
-          <w:rFonts w:ascii="微软雅黑" w:hAnsi="微软雅黑" w:eastAsia="微软雅黑"/>
-          <w:b/>
+          <w:rFonts w:hint="eastAsia"/>
           <w:color w:val="000000"/>
-          <w:sz w:val="42"/>
+          <w:sz w:val="21"/>
+          <w:lang w:val="en-US" w:eastAsia="zh-CN"/>
         </w:rPr>
-        <w:t>9组会</w:t>
+        <w:t>了</w:t>
+      </w:r>
+      <w:r>
+        <w:rPr>
+          <w:rFonts w:ascii="宋体" w:hAnsi="宋体" w:eastAsia="宋体"/>
+          <w:color w:val="000000"/>
+          <w:sz w:val="21"/>
+        </w:rPr>
+        <w:t>直接BP和FFBP在CPU与GPU上的成像结果、复数误差和驻留计算时间。固定混合精度GPU保持了同算法CPU结果，当前主要质量差异来自FFBP的分解与重采样近似。</w:t>
       </w:r>
     </w:p>
     <w:p>
@@ -61,8 +92,14 @@
         <w:pStyle w:val="3"/>
         <w:keepNext/>
         <w:keepLines/>
+        <w:rPr>
+          <w:rFonts w:hint="eastAsia" w:ascii="宋体" w:hAnsi="宋体" w:eastAsia="宋体" w:cs="宋体"/>
+        </w:rPr>
       </w:pPr>
       <w:r>
+        <w:rPr>
+          <w:rFonts w:hint="eastAsia" w:ascii="宋体" w:hAnsi="宋体" w:eastAsia="宋体" w:cs="宋体"/>
+        </w:rPr>
         <w:t>算法来源</w:t>
       </w:r>
     </w:p>
@@ -88,8 +125,8 @@
         </w:tblCellMar>
       </w:tblPr>
       <w:tblGrid>
-        <w:gridCol w:w="2096"/>
-        <w:gridCol w:w="7882"/>
+        <w:gridCol w:w="1709"/>
+        <w:gridCol w:w="8269"/>
       </w:tblGrid>
       <w:tr>
         <w:tblPrEx>
@@ -115,7 +152,7 @@
         </w:trPr>
         <w:tc>
           <w:tcPr>
-            <w:tcW w:w="2096" w:type="dxa"/>
+            <w:tcW w:w="1709" w:type="dxa"/>
             <w:shd w:val="clear" w:color="auto" w:fill="FFFFFF"/>
             <w:tcMar>
               <w:top w:w="100" w:type="dxa"/>
@@ -129,10 +166,13 @@
             <w:pPr>
               <w:spacing w:before="0" w:after="0" w:line="269" w:lineRule="auto"/>
               <w:jc w:val="center"/>
+              <w:rPr>
+                <w:rFonts w:hint="eastAsia" w:ascii="宋体" w:hAnsi="宋体" w:eastAsia="宋体" w:cs="宋体"/>
+              </w:rPr>
             </w:pPr>
             <w:r>
               <w:rPr>
-                <w:rFonts w:ascii="微软雅黑" w:hAnsi="微软雅黑" w:eastAsia="微软雅黑"/>
+                <w:rFonts w:hint="eastAsia" w:ascii="宋体" w:hAnsi="宋体" w:eastAsia="宋体" w:cs="宋体"/>
                 <w:b/>
                 <w:color w:val="000000"/>
                 <w:sz w:val="17"/>
@@ -143,7 +183,7 @@
         </w:tc>
         <w:tc>
           <w:tcPr>
-            <w:tcW w:w="7882" w:type="dxa"/>
+            <w:tcW w:w="8269" w:type="dxa"/>
             <w:shd w:val="clear" w:color="auto" w:fill="FFFFFF"/>
             <w:tcMar>
               <w:top w:w="100" w:type="dxa"/>
@@ -157,10 +197,13 @@
             <w:pPr>
               <w:spacing w:before="0" w:after="0" w:line="269" w:lineRule="auto"/>
               <w:jc w:val="center"/>
+              <w:rPr>
+                <w:rFonts w:hint="eastAsia" w:ascii="宋体" w:hAnsi="宋体" w:eastAsia="宋体" w:cs="宋体"/>
+              </w:rPr>
             </w:pPr>
             <w:r>
               <w:rPr>
-                <w:rFonts w:ascii="微软雅黑" w:hAnsi="微软雅黑" w:eastAsia="微软雅黑"/>
+                <w:rFonts w:hint="eastAsia" w:ascii="宋体" w:hAnsi="宋体" w:eastAsia="宋体" w:cs="宋体"/>
                 <w:b/>
                 <w:color w:val="000000"/>
                 <w:sz w:val="17"/>
@@ -193,7 +236,7 @@
         </w:trPr>
         <w:tc>
           <w:tcPr>
-            <w:tcW w:w="2096" w:type="dxa"/>
+            <w:tcW w:w="1709" w:type="dxa"/>
             <w:shd w:val="clear" w:color="auto" w:fill="FFFFFF"/>
             <w:tcMar>
               <w:top w:w="100" w:type="dxa"/>
@@ -207,10 +250,13 @@
             <w:pPr>
               <w:spacing w:before="0" w:after="0" w:line="269" w:lineRule="auto"/>
               <w:jc w:val="center"/>
+              <w:rPr>
+                <w:rFonts w:hint="eastAsia" w:ascii="宋体" w:hAnsi="宋体" w:eastAsia="宋体" w:cs="宋体"/>
+              </w:rPr>
             </w:pPr>
             <w:r>
               <w:rPr>
-                <w:rFonts w:ascii="微软雅黑" w:hAnsi="微软雅黑" w:eastAsia="微软雅黑"/>
+                <w:rFonts w:hint="eastAsia" w:ascii="宋体" w:hAnsi="宋体" w:eastAsia="宋体" w:cs="宋体"/>
                 <w:b w:val="0"/>
                 <w:color w:val="000000"/>
                 <w:sz w:val="16"/>
@@ -221,7 +267,7 @@
         </w:tc>
         <w:tc>
           <w:tcPr>
-            <w:tcW w:w="7882" w:type="dxa"/>
+            <w:tcW w:w="8269" w:type="dxa"/>
             <w:shd w:val="clear" w:color="auto" w:fill="FFFFFF"/>
             <w:tcMar>
               <w:top w:w="100" w:type="dxa"/>
@@ -235,15 +281,66 @@
             <w:pPr>
               <w:spacing w:before="0" w:after="0" w:line="269" w:lineRule="auto"/>
               <w:jc w:val="left"/>
+              <w:rPr>
+                <w:rFonts w:hint="eastAsia" w:ascii="宋体" w:hAnsi="宋体" w:eastAsia="宋体" w:cs="宋体"/>
+              </w:rPr>
             </w:pPr>
             <w:r>
               <w:rPr>
-                <w:rFonts w:ascii="微软雅黑" w:hAnsi="微软雅黑" w:eastAsia="微软雅黑"/>
+                <w:rFonts w:hint="eastAsia" w:ascii="宋体" w:hAnsi="宋体" w:eastAsia="宋体" w:cs="宋体"/>
                 <w:b w:val="0"/>
                 <w:color w:val="000000"/>
                 <w:sz w:val="16"/>
               </w:rPr>
-              <w:t>SAR层析反投影基础见[1]；本实验所用直接时域BP形式通常追溯至McCorkle[2]。逐像素计算双程距离，对距离压缩回波插值、相位补偿并沿孔径相干累加。</w:t>
+              <w:t>SAR层析反投影基础见</w:t>
+            </w:r>
+            <w:r>
+              <w:rPr>
+                <w:rFonts w:hint="eastAsia" w:ascii="宋体" w:hAnsi="宋体" w:eastAsia="宋体" w:cs="宋体"/>
+                <w:b w:val="0"/>
+                <w:color w:val="000000"/>
+                <w:sz w:val="16"/>
+                <w:vertAlign w:val="superscript"/>
+              </w:rPr>
+              <w:t>[1]</w:t>
+            </w:r>
+            <w:r>
+              <w:rPr>
+                <w:rFonts w:hint="eastAsia" w:cs="宋体"/>
+                <w:b w:val="0"/>
+                <w:color w:val="000000"/>
+                <w:sz w:val="16"/>
+                <w:lang w:eastAsia="zh-CN"/>
+              </w:rPr>
+              <w:t>。</w:t>
+            </w:r>
+            <w:r>
+              <w:rPr>
+                <w:rFonts w:hint="eastAsia" w:ascii="宋体" w:hAnsi="宋体" w:eastAsia="宋体" w:cs="宋体"/>
+                <w:b w:val="0"/>
+                <w:color w:val="000000"/>
+                <w:sz w:val="16"/>
+              </w:rPr>
+              <w:t>本实验所用直接时域BP形式通常追溯至McCorkle</w:t>
+            </w:r>
+            <w:r>
+              <w:rPr>
+                <w:rFonts w:hint="eastAsia" w:ascii="宋体" w:hAnsi="宋体" w:eastAsia="宋体" w:cs="宋体"/>
+                <w:b w:val="0"/>
+                <w:color w:val="000000"/>
+                <w:sz w:val="16"/>
+                <w:vertAlign w:val="superscript"/>
+              </w:rPr>
+              <w:t>[2]</w:t>
+            </w:r>
+            <w:r>
+              <w:rPr>
+                <w:rFonts w:hint="eastAsia" w:ascii="宋体" w:hAnsi="宋体" w:eastAsia="宋体" w:cs="宋体"/>
+                <w:b w:val="0"/>
+                <w:color w:val="000000"/>
+                <w:sz w:val="16"/>
+              </w:rPr>
+              <w:t>。逐像素计算双程距离，对距离压缩回波插值、相位补偿并沿孔径相干累加。</w:t>
             </w:r>
           </w:p>
         </w:tc>
@@ -271,7 +368,7 @@
         </w:trPr>
         <w:tc>
           <w:tcPr>
-            <w:tcW w:w="2096" w:type="dxa"/>
+            <w:tcW w:w="1709" w:type="dxa"/>
             <w:shd w:val="clear" w:color="auto" w:fill="FFFFFF"/>
             <w:tcMar>
               <w:top w:w="100" w:type="dxa"/>
@@ -285,10 +382,13 @@
             <w:pPr>
               <w:spacing w:before="0" w:after="0" w:line="269" w:lineRule="auto"/>
               <w:jc w:val="center"/>
+              <w:rPr>
+                <w:rFonts w:hint="eastAsia" w:ascii="宋体" w:hAnsi="宋体" w:eastAsia="宋体" w:cs="宋体"/>
+              </w:rPr>
             </w:pPr>
             <w:r>
               <w:rPr>
-                <w:rFonts w:ascii="微软雅黑" w:hAnsi="微软雅黑" w:eastAsia="微软雅黑"/>
+                <w:rFonts w:hint="eastAsia" w:ascii="宋体" w:hAnsi="宋体" w:eastAsia="宋体" w:cs="宋体"/>
                 <w:b w:val="0"/>
                 <w:color w:val="000000"/>
                 <w:sz w:val="16"/>
@@ -299,7 +399,7 @@
         </w:tc>
         <w:tc>
           <w:tcPr>
-            <w:tcW w:w="7882" w:type="dxa"/>
+            <w:tcW w:w="8269" w:type="dxa"/>
             <w:shd w:val="clear" w:color="auto" w:fill="FFFFFF"/>
             <w:tcMar>
               <w:top w:w="100" w:type="dxa"/>
@@ -313,15 +413,37 @@
             <w:pPr>
               <w:spacing w:before="0" w:after="0" w:line="269" w:lineRule="auto"/>
               <w:jc w:val="left"/>
+              <w:rPr>
+                <w:rFonts w:hint="eastAsia" w:ascii="宋体" w:hAnsi="宋体" w:eastAsia="宋体" w:cs="宋体"/>
+              </w:rPr>
             </w:pPr>
             <w:r>
               <w:rPr>
-                <w:rFonts w:ascii="微软雅黑" w:hAnsi="微软雅黑" w:eastAsia="微软雅黑"/>
+                <w:rFonts w:hint="eastAsia" w:ascii="宋体" w:hAnsi="宋体" w:eastAsia="宋体" w:cs="宋体"/>
                 <w:b w:val="0"/>
                 <w:color w:val="000000"/>
                 <w:sz w:val="16"/>
               </w:rPr>
-              <w:t>采用Ulander、Hellsten和Stenström[3]的快速因子化反投影思想：将孔径递归分组，在局部极坐标网格形成子图，经重采样后逐层合并，以插值近似换取较低计算量。</w:t>
+              <w:t>采用Ulander、Hellsten和Stenström</w:t>
+            </w:r>
+            <w:r>
+              <w:rPr>
+                <w:rFonts w:hint="eastAsia" w:ascii="宋体" w:hAnsi="宋体" w:eastAsia="宋体" w:cs="宋体"/>
+                <w:b w:val="0"/>
+                <w:color w:val="000000"/>
+                <w:sz w:val="16"/>
+                <w:vertAlign w:val="superscript"/>
+              </w:rPr>
+              <w:t>[3]</w:t>
+            </w:r>
+            <w:r>
+              <w:rPr>
+                <w:rFonts w:hint="eastAsia" w:ascii="宋体" w:hAnsi="宋体" w:eastAsia="宋体" w:cs="宋体"/>
+                <w:b w:val="0"/>
+                <w:color w:val="000000"/>
+                <w:sz w:val="16"/>
+              </w:rPr>
+              <w:t>的快速因子化反投影思想：将孔径递归分组，在局部极坐标网格形成子图，经重采样后逐层合并，以插值近似换取较低计算量。</w:t>
             </w:r>
           </w:p>
         </w:tc>
@@ -329,12 +451,20 @@
     </w:tbl>
     <w:p>
       <w:pPr>
-        <w:pStyle w:val="3"/>
+        <w:pStyle w:val="4"/>
         <w:keepNext/>
         <w:keepLines/>
+        <w:rPr>
+          <w:rFonts w:hint="eastAsia" w:ascii="宋体" w:hAnsi="宋体" w:eastAsia="宋体" w:cs="宋体"/>
+          <w:lang w:val="en-US" w:eastAsia="zh-CN"/>
+        </w:rPr>
       </w:pPr>
       <w:r>
-        <w:t>2 全场成像与四种基线</w:t>
+        <w:rPr>
+          <w:rFonts w:hint="eastAsia" w:ascii="宋体" w:hAnsi="宋体" w:eastAsia="宋体" w:cs="宋体"/>
+          <w:lang w:val="en-US" w:eastAsia="zh-CN"/>
+        </w:rPr>
+        <w:t>1 全场成像与四种基线</w:t>
       </w:r>
     </w:p>
     <w:p>
@@ -342,9 +472,22 @@
         <w:pStyle w:val="4"/>
         <w:keepNext/>
         <w:keepLines/>
+        <w:rPr>
+          <w:rFonts w:hint="eastAsia" w:ascii="宋体" w:hAnsi="宋体" w:eastAsia="宋体" w:cs="宋体"/>
+        </w:rPr>
       </w:pPr>
       <w:r>
-        <w:t>2.1 自聚焦后FFBP全场景地面图</w:t>
+        <w:rPr>
+          <w:rFonts w:hint="eastAsia" w:ascii="宋体" w:hAnsi="宋体" w:eastAsia="宋体" w:cs="宋体"/>
+          <w:lang w:val="en-US" w:eastAsia="zh-CN"/>
+        </w:rPr>
+        <w:t>1</w:t>
+      </w:r>
+      <w:r>
+        <w:rPr>
+          <w:rFonts w:hint="eastAsia" w:ascii="宋体" w:hAnsi="宋体" w:eastAsia="宋体" w:cs="宋体"/>
+        </w:rPr>
+        <w:t>.1 自聚焦后FFBP全场景地面图</w:t>
       </w:r>
     </w:p>
     <w:p>
@@ -398,23 +541,59 @@
         <w:pStyle w:val="15"/>
         <w:keepLines/>
         <w:spacing w:after="140"/>
+        <w:jc w:val="center"/>
+        <w:rPr>
+          <w:rFonts w:hint="eastAsia" w:ascii="宋体" w:hAnsi="宋体" w:eastAsia="宋体" w:cs="宋体"/>
+          <w:b w:val="0"/>
+          <w:bCs w:val="0"/>
+          <w:color w:val="000000"/>
+          <w:sz w:val="18"/>
+        </w:rPr>
       </w:pPr>
       <w:r>
         <w:rPr>
-          <w:rFonts w:ascii="微软雅黑" w:hAnsi="微软雅黑" w:eastAsia="微软雅黑"/>
-          <w:b/>
+          <w:rFonts w:hint="eastAsia" w:ascii="宋体" w:hAnsi="宋体" w:eastAsia="宋体" w:cs="宋体"/>
+          <w:b w:val="0"/>
+          <w:bCs w:val="0"/>
           <w:color w:val="000000"/>
           <w:sz w:val="18"/>
         </w:rPr>
-        <w:t xml:space="preserve">图1 </w:t>
+        <w:t>图1 2018-08-14_18-54-08.dat的FFBP/PGA自聚焦地面成像结果</w:t>
       </w:r>
+    </w:p>
+    <w:p>
+      <w:pPr>
+        <w:pStyle w:val="15"/>
+        <w:keepNext w:val="0"/>
+        <w:keepLines/>
+        <w:pageBreakBefore w:val="0"/>
+        <w:widowControl/>
+        <w:kinsoku/>
+        <w:wordWrap/>
+        <w:overflowPunct/>
+        <w:topLinePunct w:val="0"/>
+        <w:autoSpaceDE/>
+        <w:autoSpaceDN/>
+        <w:bidi w:val="0"/>
+        <w:adjustRightInd/>
+        <w:snapToGrid/>
+        <w:spacing w:after="140" w:line="360" w:lineRule="auto"/>
+        <w:ind w:firstLine="420" w:firstLineChars="200"/>
+        <w:textAlignment w:val="auto"/>
+        <w:rPr>
+          <w:rFonts w:hint="eastAsia" w:ascii="宋体" w:hAnsi="宋体" w:eastAsia="宋体" w:cs="宋体"/>
+          <w:sz w:val="21"/>
+          <w:szCs w:val="21"/>
+        </w:rPr>
+      </w:pPr>
       <w:r>
         <w:rPr>
-          <w:rFonts w:ascii="微软雅黑" w:hAnsi="微软雅黑" w:eastAsia="微软雅黑"/>
+          <w:rFonts w:hint="eastAsia" w:ascii="宋体" w:hAnsi="宋体" w:eastAsia="宋体" w:cs="宋体"/>
           <w:color w:val="000000"/>
-          <w:sz w:val="18"/>
+          <w:sz w:val="21"/>
+          <w:szCs w:val="21"/>
         </w:rPr>
-        <w:t>2018-08-14_18-54-08.dat的FFBP/PGA自聚焦地面成像结果。横向显示范围为450至2650 m，航向范围为-800至800 m，幅度窗为-65至-10 dB。该图对应全场景FFBP结果，不作为四种CPU/GPU基线的同网格定量对照。</w:t>
+        <w:t>横向显示范围为450至2650 m，航向范围为-800至800 m，幅度窗为-65至-10 dB。该图对应全场景FFBP结果，不作为四种CPU/GPU基线的同网格定量对照。</w:t>
       </w:r>
     </w:p>
     <w:p>
@@ -427,22 +606,18 @@
         <w:pStyle w:val="4"/>
         <w:keepNext/>
         <w:keepLines/>
+        <w:rPr>
+          <w:rFonts w:hint="eastAsia" w:ascii="宋体" w:hAnsi="宋体" w:eastAsia="宋体" w:cs="宋体"/>
+          <w:lang w:val="en-US" w:eastAsia="zh-CN"/>
+        </w:rPr>
       </w:pPr>
       <w:r>
-        <w:t>2.2 CPU与GPU四</w:t>
+        <w:rPr>
+          <w:rFonts w:hint="eastAsia" w:ascii="宋体" w:hAnsi="宋体" w:eastAsia="宋体" w:cs="宋体"/>
+          <w:lang w:val="en-US" w:eastAsia="zh-CN"/>
+        </w:rPr>
+        <w:t>1.2 CPU与GPU四种基线</w:t>
       </w:r>
-      <w:r>
-        <w:rPr>
-          <w:b w:val="0"/>
-          <w:bCs w:val="0"/>
-        </w:rPr>
-        <w:t>种</w:t>
-      </w:r>
-      <w:r>
-        <w:t>基线</w:t>
-      </w:r>
-      <w:bookmarkStart w:id="0" w:name="_GoBack"/>
-      <w:bookmarkEnd w:id="0"/>
     </w:p>
     <w:p>
       <w:pPr>
@@ -495,23 +670,75 @@
         <w:pStyle w:val="15"/>
         <w:keepLines/>
         <w:spacing w:after="140"/>
+        <w:jc w:val="center"/>
+        <w:rPr>
+          <w:rFonts w:hint="eastAsia" w:ascii="宋体" w:hAnsi="宋体" w:eastAsia="宋体" w:cs="宋体"/>
+          <w:color w:val="000000"/>
+          <w:sz w:val="18"/>
+        </w:rPr>
       </w:pPr>
       <w:r>
         <w:rPr>
-          <w:rFonts w:ascii="微软雅黑" w:hAnsi="微软雅黑" w:eastAsia="微软雅黑"/>
+          <w:rFonts w:hint="eastAsia" w:ascii="宋体" w:hAnsi="宋体" w:eastAsia="宋体" w:cs="宋体"/>
+          <w:b w:val="0"/>
+          <w:bCs w:val="0"/>
+          <w:color w:val="000000"/>
+          <w:sz w:val="18"/>
+        </w:rPr>
+        <w:t>图2</w:t>
+      </w:r>
+      <w:r>
+        <w:rPr>
+          <w:rFonts w:hint="eastAsia" w:ascii="宋体" w:hAnsi="宋体" w:eastAsia="宋体" w:cs="宋体"/>
           <w:b/>
           <w:color w:val="000000"/>
           <w:sz w:val="18"/>
         </w:rPr>
-        <w:t xml:space="preserve">图2 </w:t>
+        <w:t xml:space="preserve"> </w:t>
       </w:r>
       <w:r>
         <w:rPr>
-          <w:rFonts w:ascii="微软雅黑" w:hAnsi="微软雅黑" w:eastAsia="微软雅黑"/>
+          <w:rFonts w:hint="eastAsia" w:ascii="宋体" w:hAnsi="宋体" w:eastAsia="宋体" w:cs="宋体"/>
           <w:color w:val="000000"/>
           <w:sz w:val="18"/>
         </w:rPr>
-        <w:t>同一实测ROI的四种成像结果。上行为直接BP，下行为FFBP；左列为CPU，右列为固定混合精度GPU。四幅图以CPU直接BP峰值为共同参考，显示范围均为-50至0 dB。图中为极坐标复图像的幅度，不是地面投影图。</w:t>
+        <w:t>同一实测ROI的四种成像结果</w:t>
+      </w:r>
+    </w:p>
+    <w:p>
+      <w:pPr>
+        <w:pStyle w:val="15"/>
+        <w:keepNext w:val="0"/>
+        <w:keepLines/>
+        <w:pageBreakBefore w:val="0"/>
+        <w:widowControl/>
+        <w:kinsoku/>
+        <w:wordWrap/>
+        <w:overflowPunct/>
+        <w:topLinePunct w:val="0"/>
+        <w:autoSpaceDE/>
+        <w:autoSpaceDN/>
+        <w:bidi w:val="0"/>
+        <w:adjustRightInd/>
+        <w:snapToGrid/>
+        <w:spacing w:after="140" w:line="360" w:lineRule="auto"/>
+        <w:ind w:firstLine="420" w:firstLineChars="200"/>
+        <w:textAlignment w:val="auto"/>
+        <w:rPr>
+          <w:rFonts w:hint="eastAsia" w:ascii="宋体" w:hAnsi="宋体" w:eastAsia="宋体" w:cs="宋体"/>
+          <w:color w:val="000000"/>
+          <w:sz w:val="21"/>
+          <w:szCs w:val="21"/>
+        </w:rPr>
+      </w:pPr>
+      <w:r>
+        <w:rPr>
+          <w:rFonts w:hint="eastAsia" w:ascii="宋体" w:hAnsi="宋体" w:eastAsia="宋体" w:cs="宋体"/>
+          <w:color w:val="000000"/>
+          <w:sz w:val="21"/>
+          <w:szCs w:val="21"/>
+        </w:rPr>
+        <w:t>上行为直接BP，下行为FFBP；左列为CPU，右列为固定混合精度GPU。四幅图以CPU直接BP峰值为共同参考，显示范围均为-50至0 dB。图中为极坐标复图像的幅度，不是地面投影图。</w:t>
       </w:r>
     </w:p>
     <w:tbl>
@@ -536,9 +763,9 @@
         </w:tblCellMar>
       </w:tblPr>
       <w:tblGrid>
-        <w:gridCol w:w="1663"/>
-        <w:gridCol w:w="1663"/>
-        <w:gridCol w:w="1663"/>
+        <w:gridCol w:w="1847"/>
+        <w:gridCol w:w="1560"/>
+        <w:gridCol w:w="1582"/>
         <w:gridCol w:w="1663"/>
         <w:gridCol w:w="1663"/>
         <w:gridCol w:w="1663"/>
@@ -567,7 +794,7 @@
         </w:trPr>
         <w:tc>
           <w:tcPr>
-            <w:tcW w:w="1814" w:type="dxa"/>
+            <w:tcW w:w="1847" w:type="dxa"/>
             <w:shd w:val="clear" w:color="auto" w:fill="FFFFFF"/>
             <w:tcMar>
               <w:top w:w="100" w:type="dxa"/>
@@ -581,10 +808,13 @@
             <w:pPr>
               <w:spacing w:before="0" w:after="0" w:line="269" w:lineRule="auto"/>
               <w:jc w:val="center"/>
+              <w:rPr>
+                <w:rFonts w:hint="eastAsia" w:ascii="宋体" w:hAnsi="宋体" w:eastAsia="宋体" w:cs="宋体"/>
+              </w:rPr>
             </w:pPr>
             <w:r>
               <w:rPr>
-                <w:rFonts w:ascii="微软雅黑" w:hAnsi="微软雅黑" w:eastAsia="微软雅黑"/>
+                <w:rFonts w:hint="eastAsia" w:ascii="宋体" w:hAnsi="宋体" w:eastAsia="宋体" w:cs="宋体"/>
                 <w:b/>
                 <w:color w:val="000000"/>
                 <w:sz w:val="17"/>
@@ -595,7 +825,7 @@
         </w:tc>
         <w:tc>
           <w:tcPr>
-            <w:tcW w:w="1531" w:type="dxa"/>
+            <w:tcW w:w="1560" w:type="dxa"/>
             <w:shd w:val="clear" w:color="auto" w:fill="FFFFFF"/>
             <w:tcMar>
               <w:top w:w="100" w:type="dxa"/>
@@ -609,10 +839,13 @@
             <w:pPr>
               <w:spacing w:before="0" w:after="0" w:line="269" w:lineRule="auto"/>
               <w:jc w:val="center"/>
+              <w:rPr>
+                <w:rFonts w:hint="eastAsia" w:ascii="宋体" w:hAnsi="宋体" w:eastAsia="宋体" w:cs="宋体"/>
+              </w:rPr>
             </w:pPr>
             <w:r>
               <w:rPr>
-                <w:rFonts w:ascii="微软雅黑" w:hAnsi="微软雅黑" w:eastAsia="微软雅黑"/>
+                <w:rFonts w:hint="eastAsia" w:ascii="宋体" w:hAnsi="宋体" w:eastAsia="宋体" w:cs="宋体"/>
                 <w:b/>
                 <w:color w:val="000000"/>
                 <w:sz w:val="17"/>
@@ -623,7 +856,7 @@
         </w:tc>
         <w:tc>
           <w:tcPr>
-            <w:tcW w:w="1531" w:type="dxa"/>
+            <w:tcW w:w="1582" w:type="dxa"/>
             <w:shd w:val="clear" w:color="auto" w:fill="FFFFFF"/>
             <w:tcMar>
               <w:top w:w="100" w:type="dxa"/>
@@ -637,10 +870,13 @@
             <w:pPr>
               <w:spacing w:before="0" w:after="0" w:line="269" w:lineRule="auto"/>
               <w:jc w:val="center"/>
+              <w:rPr>
+                <w:rFonts w:hint="eastAsia" w:ascii="宋体" w:hAnsi="宋体" w:eastAsia="宋体" w:cs="宋体"/>
+              </w:rPr>
             </w:pPr>
             <w:r>
               <w:rPr>
-                <w:rFonts w:ascii="微软雅黑" w:hAnsi="微软雅黑" w:eastAsia="微软雅黑"/>
+                <w:rFonts w:hint="eastAsia" w:ascii="宋体" w:hAnsi="宋体" w:eastAsia="宋体" w:cs="宋体"/>
                 <w:b/>
                 <w:color w:val="000000"/>
                 <w:sz w:val="17"/>
@@ -651,7 +887,7 @@
         </w:tc>
         <w:tc>
           <w:tcPr>
-            <w:tcW w:w="1701" w:type="dxa"/>
+            <w:tcW w:w="1663" w:type="dxa"/>
             <w:shd w:val="clear" w:color="auto" w:fill="FFFFFF"/>
             <w:tcMar>
               <w:top w:w="100" w:type="dxa"/>
@@ -665,10 +901,13 @@
             <w:pPr>
               <w:spacing w:before="0" w:after="0" w:line="269" w:lineRule="auto"/>
               <w:jc w:val="center"/>
+              <w:rPr>
+                <w:rFonts w:hint="eastAsia" w:ascii="宋体" w:hAnsi="宋体" w:eastAsia="宋体" w:cs="宋体"/>
+              </w:rPr>
             </w:pPr>
             <w:r>
               <w:rPr>
-                <w:rFonts w:ascii="微软雅黑" w:hAnsi="微软雅黑" w:eastAsia="微软雅黑"/>
+                <w:rFonts w:hint="eastAsia" w:ascii="宋体" w:hAnsi="宋体" w:eastAsia="宋体" w:cs="宋体"/>
                 <w:b/>
                 <w:color w:val="000000"/>
                 <w:sz w:val="17"/>
@@ -679,7 +918,7 @@
         </w:tc>
         <w:tc>
           <w:tcPr>
-            <w:tcW w:w="1247" w:type="dxa"/>
+            <w:tcW w:w="1663" w:type="dxa"/>
             <w:shd w:val="clear" w:color="auto" w:fill="FFFFFF"/>
             <w:tcMar>
               <w:top w:w="100" w:type="dxa"/>
@@ -693,10 +932,13 @@
             <w:pPr>
               <w:spacing w:before="0" w:after="0" w:line="269" w:lineRule="auto"/>
               <w:jc w:val="center"/>
+              <w:rPr>
+                <w:rFonts w:hint="eastAsia" w:ascii="宋体" w:hAnsi="宋体" w:eastAsia="宋体" w:cs="宋体"/>
+              </w:rPr>
             </w:pPr>
             <w:r>
               <w:rPr>
-                <w:rFonts w:ascii="微软雅黑" w:hAnsi="微软雅黑" w:eastAsia="微软雅黑"/>
+                <w:rFonts w:hint="eastAsia" w:ascii="宋体" w:hAnsi="宋体" w:eastAsia="宋体" w:cs="宋体"/>
                 <w:b/>
                 <w:color w:val="000000"/>
                 <w:sz w:val="17"/>
@@ -707,7 +949,7 @@
         </w:tc>
         <w:tc>
           <w:tcPr>
-            <w:tcW w:w="1304" w:type="dxa"/>
+            <w:tcW w:w="1663" w:type="dxa"/>
             <w:shd w:val="clear" w:color="auto" w:fill="FFFFFF"/>
             <w:tcMar>
               <w:top w:w="100" w:type="dxa"/>
@@ -721,10 +963,13 @@
             <w:pPr>
               <w:spacing w:before="0" w:after="0" w:line="269" w:lineRule="auto"/>
               <w:jc w:val="center"/>
+              <w:rPr>
+                <w:rFonts w:hint="eastAsia" w:ascii="宋体" w:hAnsi="宋体" w:eastAsia="宋体" w:cs="宋体"/>
+              </w:rPr>
             </w:pPr>
             <w:r>
               <w:rPr>
-                <w:rFonts w:ascii="微软雅黑" w:hAnsi="微软雅黑" w:eastAsia="微软雅黑"/>
+                <w:rFonts w:hint="eastAsia" w:ascii="宋体" w:hAnsi="宋体" w:eastAsia="宋体" w:cs="宋体"/>
                 <w:b/>
                 <w:color w:val="000000"/>
                 <w:sz w:val="17"/>
@@ -757,35 +1002,7 @@
         </w:trPr>
         <w:tc>
           <w:tcPr>
-            <w:tcW w:w="1814" w:type="dxa"/>
-            <w:shd w:val="clear" w:color="auto" w:fill="FFFFFF"/>
-            <w:tcMar>
-              <w:top w:w="100" w:type="dxa"/>
-              <w:left w:w="100" w:type="dxa"/>
-              <w:bottom w:w="100" w:type="dxa"/>
-              <w:right w:w="100" w:type="dxa"/>
-            </w:tcMar>
-            <w:vAlign w:val="center"/>
-          </w:tcPr>
-          <w:p>
-            <w:pPr>
-              <w:spacing w:before="0" w:after="0" w:line="269" w:lineRule="auto"/>
-              <w:jc w:val="left"/>
-            </w:pPr>
-            <w:r>
-              <w:rPr>
-                <w:rFonts w:ascii="微软雅黑" w:hAnsi="微软雅黑" w:eastAsia="微软雅黑"/>
-                <w:b w:val="0"/>
-                <w:color w:val="000000"/>
-                <w:sz w:val="16"/>
-              </w:rPr>
-              <w:t>CPU直接BP</w:t>
-            </w:r>
-          </w:p>
-        </w:tc>
-        <w:tc>
-          <w:tcPr>
-            <w:tcW w:w="1531" w:type="dxa"/>
+            <w:tcW w:w="1847" w:type="dxa"/>
             <w:shd w:val="clear" w:color="auto" w:fill="FFFFFF"/>
             <w:tcMar>
               <w:top w:w="100" w:type="dxa"/>
@@ -799,49 +1016,24 @@
             <w:pPr>
               <w:spacing w:before="0" w:after="0" w:line="269" w:lineRule="auto"/>
               <w:jc w:val="center"/>
+              <w:rPr>
+                <w:rFonts w:hint="eastAsia" w:ascii="宋体" w:hAnsi="宋体" w:eastAsia="宋体" w:cs="宋体"/>
+              </w:rPr>
             </w:pPr>
             <w:r>
               <w:rPr>
-                <w:rFonts w:ascii="微软雅黑" w:hAnsi="微软雅黑" w:eastAsia="微软雅黑"/>
+                <w:rFonts w:hint="eastAsia" w:ascii="宋体" w:hAnsi="宋体" w:eastAsia="宋体" w:cs="宋体"/>
                 <w:b w:val="0"/>
                 <w:color w:val="000000"/>
                 <w:sz w:val="16"/>
               </w:rPr>
-              <w:t>10,200.507 ms</w:t>
+              <w:t>CPU直接BP</w:t>
             </w:r>
           </w:p>
         </w:tc>
         <w:tc>
           <w:tcPr>
-            <w:tcW w:w="1531" w:type="dxa"/>
-            <w:shd w:val="clear" w:color="auto" w:fill="FFFFFF"/>
-            <w:tcMar>
-              <w:top w:w="100" w:type="dxa"/>
-              <w:left w:w="100" w:type="dxa"/>
-              <w:bottom w:w="100" w:type="dxa"/>
-              <w:right w:w="100" w:type="dxa"/>
-            </w:tcMar>
-            <w:vAlign w:val="center"/>
-          </w:tcPr>
-          <w:p>
-            <w:pPr>
-              <w:spacing w:before="0" w:after="0" w:line="269" w:lineRule="auto"/>
-              <w:jc w:val="left"/>
-            </w:pPr>
-            <w:r>
-              <w:rPr>
-                <w:rFonts w:ascii="微软雅黑" w:hAnsi="微软雅黑" w:eastAsia="微软雅黑"/>
-                <w:b w:val="0"/>
-                <w:color w:val="000000"/>
-                <w:sz w:val="16"/>
-              </w:rPr>
-              <w:t>高精度基准</w:t>
-            </w:r>
-          </w:p>
-        </w:tc>
-        <w:tc>
-          <w:tcPr>
-            <w:tcW w:w="1701" w:type="dxa"/>
+            <w:tcW w:w="1560" w:type="dxa"/>
             <w:shd w:val="clear" w:color="auto" w:fill="FFFFFF"/>
             <w:tcMar>
               <w:top w:w="100" w:type="dxa"/>
@@ -855,21 +1047,24 @@
             <w:pPr>
               <w:spacing w:before="0" w:after="0" w:line="269" w:lineRule="auto"/>
               <w:jc w:val="center"/>
+              <w:rPr>
+                <w:rFonts w:hint="eastAsia" w:ascii="宋体" w:hAnsi="宋体" w:eastAsia="宋体" w:cs="宋体"/>
+              </w:rPr>
             </w:pPr>
             <w:r>
               <w:rPr>
-                <w:rFonts w:ascii="微软雅黑" w:hAnsi="微软雅黑" w:eastAsia="微软雅黑"/>
+                <w:rFonts w:hint="eastAsia" w:ascii="宋体" w:hAnsi="宋体" w:eastAsia="宋体" w:cs="宋体"/>
                 <w:b w:val="0"/>
                 <w:color w:val="000000"/>
                 <w:sz w:val="16"/>
               </w:rPr>
-              <w:t>-</w:t>
+              <w:t>10,200.507 ms</w:t>
             </w:r>
           </w:p>
         </w:tc>
         <w:tc>
           <w:tcPr>
-            <w:tcW w:w="1247" w:type="dxa"/>
+            <w:tcW w:w="1582" w:type="dxa"/>
             <w:shd w:val="clear" w:color="auto" w:fill="FFFFFF"/>
             <w:tcMar>
               <w:top w:w="100" w:type="dxa"/>
@@ -883,21 +1078,24 @@
             <w:pPr>
               <w:spacing w:before="0" w:after="0" w:line="269" w:lineRule="auto"/>
               <w:jc w:val="center"/>
+              <w:rPr>
+                <w:rFonts w:hint="eastAsia" w:ascii="宋体" w:hAnsi="宋体" w:eastAsia="宋体" w:cs="宋体"/>
+              </w:rPr>
             </w:pPr>
             <w:r>
               <w:rPr>
-                <w:rFonts w:ascii="微软雅黑" w:hAnsi="微软雅黑" w:eastAsia="微软雅黑"/>
+                <w:rFonts w:hint="eastAsia" w:ascii="宋体" w:hAnsi="宋体" w:eastAsia="宋体" w:cs="宋体"/>
                 <w:b w:val="0"/>
                 <w:color w:val="000000"/>
                 <w:sz w:val="16"/>
               </w:rPr>
-              <w:t>-</w:t>
+              <w:t>高精度基准</w:t>
             </w:r>
           </w:p>
         </w:tc>
         <w:tc>
           <w:tcPr>
-            <w:tcW w:w="1304" w:type="dxa"/>
+            <w:tcW w:w="1663" w:type="dxa"/>
             <w:shd w:val="clear" w:color="auto" w:fill="FFFFFF"/>
             <w:tcMar>
               <w:top w:w="100" w:type="dxa"/>
@@ -911,10 +1109,75 @@
             <w:pPr>
               <w:spacing w:before="0" w:after="0" w:line="269" w:lineRule="auto"/>
               <w:jc w:val="center"/>
+              <w:rPr>
+                <w:rFonts w:hint="eastAsia" w:ascii="宋体" w:hAnsi="宋体" w:eastAsia="宋体" w:cs="宋体"/>
+              </w:rPr>
             </w:pPr>
             <w:r>
               <w:rPr>
-                <w:rFonts w:ascii="微软雅黑" w:hAnsi="微软雅黑" w:eastAsia="微软雅黑"/>
+                <w:rFonts w:hint="eastAsia" w:ascii="宋体" w:hAnsi="宋体" w:eastAsia="宋体" w:cs="宋体"/>
+                <w:b w:val="0"/>
+                <w:color w:val="000000"/>
+                <w:sz w:val="16"/>
+              </w:rPr>
+              <w:t>-</w:t>
+            </w:r>
+          </w:p>
+        </w:tc>
+        <w:tc>
+          <w:tcPr>
+            <w:tcW w:w="1663" w:type="dxa"/>
+            <w:shd w:val="clear" w:color="auto" w:fill="FFFFFF"/>
+            <w:tcMar>
+              <w:top w:w="100" w:type="dxa"/>
+              <w:left w:w="100" w:type="dxa"/>
+              <w:bottom w:w="100" w:type="dxa"/>
+              <w:right w:w="100" w:type="dxa"/>
+            </w:tcMar>
+            <w:vAlign w:val="center"/>
+          </w:tcPr>
+          <w:p>
+            <w:pPr>
+              <w:spacing w:before="0" w:after="0" w:line="269" w:lineRule="auto"/>
+              <w:jc w:val="center"/>
+              <w:rPr>
+                <w:rFonts w:hint="eastAsia" w:ascii="宋体" w:hAnsi="宋体" w:eastAsia="宋体" w:cs="宋体"/>
+              </w:rPr>
+            </w:pPr>
+            <w:r>
+              <w:rPr>
+                <w:rFonts w:hint="eastAsia" w:ascii="宋体" w:hAnsi="宋体" w:eastAsia="宋体" w:cs="宋体"/>
+                <w:b w:val="0"/>
+                <w:color w:val="000000"/>
+                <w:sz w:val="16"/>
+              </w:rPr>
+              <w:t>-</w:t>
+            </w:r>
+          </w:p>
+        </w:tc>
+        <w:tc>
+          <w:tcPr>
+            <w:tcW w:w="1663" w:type="dxa"/>
+            <w:shd w:val="clear" w:color="auto" w:fill="FFFFFF"/>
+            <w:tcMar>
+              <w:top w:w="100" w:type="dxa"/>
+              <w:left w:w="100" w:type="dxa"/>
+              <w:bottom w:w="100" w:type="dxa"/>
+              <w:right w:w="100" w:type="dxa"/>
+            </w:tcMar>
+            <w:vAlign w:val="center"/>
+          </w:tcPr>
+          <w:p>
+            <w:pPr>
+              <w:spacing w:before="0" w:after="0" w:line="269" w:lineRule="auto"/>
+              <w:jc w:val="center"/>
+              <w:rPr>
+                <w:rFonts w:hint="eastAsia" w:ascii="宋体" w:hAnsi="宋体" w:eastAsia="宋体" w:cs="宋体"/>
+              </w:rPr>
+            </w:pPr>
+            <w:r>
+              <w:rPr>
+                <w:rFonts w:hint="eastAsia" w:ascii="宋体" w:hAnsi="宋体" w:eastAsia="宋体" w:cs="宋体"/>
                 <w:b w:val="0"/>
                 <w:color w:val="000000"/>
                 <w:sz w:val="16"/>
@@ -947,35 +1210,7 @@
         </w:trPr>
         <w:tc>
           <w:tcPr>
-            <w:tcW w:w="1814" w:type="dxa"/>
-            <w:shd w:val="clear" w:color="auto" w:fill="FFFFFF"/>
-            <w:tcMar>
-              <w:top w:w="100" w:type="dxa"/>
-              <w:left w:w="100" w:type="dxa"/>
-              <w:bottom w:w="100" w:type="dxa"/>
-              <w:right w:w="100" w:type="dxa"/>
-            </w:tcMar>
-            <w:vAlign w:val="center"/>
-          </w:tcPr>
-          <w:p>
-            <w:pPr>
-              <w:spacing w:before="0" w:after="0" w:line="269" w:lineRule="auto"/>
-              <w:jc w:val="left"/>
-            </w:pPr>
-            <w:r>
-              <w:rPr>
-                <w:rFonts w:ascii="微软雅黑" w:hAnsi="微软雅黑" w:eastAsia="微软雅黑"/>
-                <w:b w:val="0"/>
-                <w:color w:val="000000"/>
-                <w:sz w:val="16"/>
-              </w:rPr>
-              <w:t>GPU直接BP 固定混合</w:t>
-            </w:r>
-          </w:p>
-        </w:tc>
-        <w:tc>
-          <w:tcPr>
-            <w:tcW w:w="1531" w:type="dxa"/>
+            <w:tcW w:w="1847" w:type="dxa"/>
             <w:shd w:val="clear" w:color="auto" w:fill="FFFFFF"/>
             <w:tcMar>
               <w:top w:w="100" w:type="dxa"/>
@@ -989,49 +1224,24 @@
             <w:pPr>
               <w:spacing w:before="0" w:after="0" w:line="269" w:lineRule="auto"/>
               <w:jc w:val="center"/>
+              <w:rPr>
+                <w:rFonts w:hint="eastAsia" w:ascii="宋体" w:hAnsi="宋体" w:eastAsia="宋体" w:cs="宋体"/>
+              </w:rPr>
             </w:pPr>
             <w:r>
               <w:rPr>
-                <w:rFonts w:ascii="微软雅黑" w:hAnsi="微软雅黑" w:eastAsia="微软雅黑"/>
+                <w:rFonts w:hint="eastAsia" w:ascii="宋体" w:hAnsi="宋体" w:eastAsia="宋体" w:cs="宋体"/>
                 <w:b w:val="0"/>
                 <w:color w:val="000000"/>
                 <w:sz w:val="16"/>
               </w:rPr>
-              <w:t>611.359 ms</w:t>
+              <w:t>GPU直接BP 固定混合</w:t>
             </w:r>
           </w:p>
         </w:tc>
         <w:tc>
           <w:tcPr>
-            <w:tcW w:w="1531" w:type="dxa"/>
-            <w:shd w:val="clear" w:color="auto" w:fill="FFFFFF"/>
-            <w:tcMar>
-              <w:top w:w="100" w:type="dxa"/>
-              <w:left w:w="100" w:type="dxa"/>
-              <w:bottom w:w="100" w:type="dxa"/>
-              <w:right w:w="100" w:type="dxa"/>
-            </w:tcMar>
-            <w:vAlign w:val="center"/>
-          </w:tcPr>
-          <w:p>
-            <w:pPr>
-              <w:spacing w:before="0" w:after="0" w:line="269" w:lineRule="auto"/>
-              <w:jc w:val="left"/>
-            </w:pPr>
-            <w:r>
-              <w:rPr>
-                <w:rFonts w:ascii="微软雅黑" w:hAnsi="微软雅黑" w:eastAsia="微软雅黑"/>
-                <w:b w:val="0"/>
-                <w:color w:val="000000"/>
-                <w:sz w:val="16"/>
-              </w:rPr>
-              <w:t>CPU直接BP</w:t>
-            </w:r>
-          </w:p>
-        </w:tc>
-        <w:tc>
-          <w:tcPr>
-            <w:tcW w:w="1701" w:type="dxa"/>
+            <w:tcW w:w="1560" w:type="dxa"/>
             <w:shd w:val="clear" w:color="auto" w:fill="FFFFFF"/>
             <w:tcMar>
               <w:top w:w="100" w:type="dxa"/>
@@ -1045,31 +1255,24 @@
             <w:pPr>
               <w:spacing w:before="0" w:after="0" w:line="269" w:lineRule="auto"/>
               <w:jc w:val="center"/>
+              <w:rPr>
+                <w:rFonts w:hint="eastAsia" w:ascii="宋体" w:hAnsi="宋体" w:eastAsia="宋体" w:cs="宋体"/>
+              </w:rPr>
             </w:pPr>
             <w:r>
               <w:rPr>
-                <w:rFonts w:ascii="微软雅黑" w:hAnsi="微软雅黑" w:eastAsia="微软雅黑"/>
+                <w:rFonts w:hint="eastAsia" w:ascii="宋体" w:hAnsi="宋体" w:eastAsia="宋体" w:cs="宋体"/>
                 <w:b w:val="0"/>
                 <w:color w:val="000000"/>
                 <w:sz w:val="16"/>
               </w:rPr>
-              <w:t>1.879×10</w:t>
-            </w:r>
-            <w:r>
-              <w:rPr>
-                <w:rFonts w:ascii="微软雅黑" w:hAnsi="微软雅黑" w:eastAsia="微软雅黑"/>
-                <w:b w:val="0"/>
-                <w:color w:val="000000"/>
-                <w:sz w:val="16"/>
-                <w:vertAlign w:val="superscript"/>
-              </w:rPr>
-              <w:t>-6</w:t>
+              <w:t>611.359 ms</w:t>
             </w:r>
           </w:p>
         </w:tc>
         <w:tc>
           <w:tcPr>
-            <w:tcW w:w="1247" w:type="dxa"/>
+            <w:tcW w:w="1582" w:type="dxa"/>
             <w:shd w:val="clear" w:color="auto" w:fill="FFFFFF"/>
             <w:tcMar>
               <w:top w:w="100" w:type="dxa"/>
@@ -1083,21 +1286,24 @@
             <w:pPr>
               <w:spacing w:before="0" w:after="0" w:line="269" w:lineRule="auto"/>
               <w:jc w:val="center"/>
+              <w:rPr>
+                <w:rFonts w:hint="eastAsia" w:ascii="宋体" w:hAnsi="宋体" w:eastAsia="宋体" w:cs="宋体"/>
+              </w:rPr>
             </w:pPr>
             <w:r>
               <w:rPr>
-                <w:rFonts w:ascii="微软雅黑" w:hAnsi="微软雅黑" w:eastAsia="微软雅黑"/>
+                <w:rFonts w:hint="eastAsia" w:ascii="宋体" w:hAnsi="宋体" w:eastAsia="宋体" w:cs="宋体"/>
                 <w:b w:val="0"/>
                 <w:color w:val="000000"/>
                 <w:sz w:val="16"/>
               </w:rPr>
-              <w:t>114.52</w:t>
+              <w:t>CPU直接BP</w:t>
             </w:r>
           </w:p>
         </w:tc>
         <w:tc>
           <w:tcPr>
-            <w:tcW w:w="1304" w:type="dxa"/>
+            <w:tcW w:w="1663" w:type="dxa"/>
             <w:shd w:val="clear" w:color="auto" w:fill="FFFFFF"/>
             <w:tcMar>
               <w:top w:w="100" w:type="dxa"/>
@@ -1111,10 +1317,85 @@
             <w:pPr>
               <w:spacing w:before="0" w:after="0" w:line="269" w:lineRule="auto"/>
               <w:jc w:val="center"/>
+              <w:rPr>
+                <w:rFonts w:hint="eastAsia" w:ascii="宋体" w:hAnsi="宋体" w:eastAsia="宋体" w:cs="宋体"/>
+              </w:rPr>
             </w:pPr>
             <w:r>
               <w:rPr>
-                <w:rFonts w:ascii="微软雅黑" w:hAnsi="微软雅黑" w:eastAsia="微软雅黑"/>
+                <w:rFonts w:hint="eastAsia" w:ascii="宋体" w:hAnsi="宋体" w:eastAsia="宋体" w:cs="宋体"/>
+                <w:b w:val="0"/>
+                <w:color w:val="000000"/>
+                <w:sz w:val="16"/>
+              </w:rPr>
+              <w:t>1.879×10</w:t>
+            </w:r>
+            <w:r>
+              <w:rPr>
+                <w:rFonts w:hint="eastAsia" w:ascii="宋体" w:hAnsi="宋体" w:eastAsia="宋体" w:cs="宋体"/>
+                <w:b w:val="0"/>
+                <w:color w:val="000000"/>
+                <w:sz w:val="16"/>
+                <w:vertAlign w:val="superscript"/>
+              </w:rPr>
+              <w:t>-6</w:t>
+            </w:r>
+          </w:p>
+        </w:tc>
+        <w:tc>
+          <w:tcPr>
+            <w:tcW w:w="1663" w:type="dxa"/>
+            <w:shd w:val="clear" w:color="auto" w:fill="FFFFFF"/>
+            <w:tcMar>
+              <w:top w:w="100" w:type="dxa"/>
+              <w:left w:w="100" w:type="dxa"/>
+              <w:bottom w:w="100" w:type="dxa"/>
+              <w:right w:w="100" w:type="dxa"/>
+            </w:tcMar>
+            <w:vAlign w:val="center"/>
+          </w:tcPr>
+          <w:p>
+            <w:pPr>
+              <w:spacing w:before="0" w:after="0" w:line="269" w:lineRule="auto"/>
+              <w:jc w:val="center"/>
+              <w:rPr>
+                <w:rFonts w:hint="eastAsia" w:ascii="宋体" w:hAnsi="宋体" w:eastAsia="宋体" w:cs="宋体"/>
+              </w:rPr>
+            </w:pPr>
+            <w:r>
+              <w:rPr>
+                <w:rFonts w:hint="eastAsia" w:ascii="宋体" w:hAnsi="宋体" w:eastAsia="宋体" w:cs="宋体"/>
+                <w:b w:val="0"/>
+                <w:color w:val="000000"/>
+                <w:sz w:val="16"/>
+              </w:rPr>
+              <w:t>114.52</w:t>
+            </w:r>
+          </w:p>
+        </w:tc>
+        <w:tc>
+          <w:tcPr>
+            <w:tcW w:w="1663" w:type="dxa"/>
+            <w:shd w:val="clear" w:color="auto" w:fill="FFFFFF"/>
+            <w:tcMar>
+              <w:top w:w="100" w:type="dxa"/>
+              <w:left w:w="100" w:type="dxa"/>
+              <w:bottom w:w="100" w:type="dxa"/>
+              <w:right w:w="100" w:type="dxa"/>
+            </w:tcMar>
+            <w:vAlign w:val="center"/>
+          </w:tcPr>
+          <w:p>
+            <w:pPr>
+              <w:spacing w:before="0" w:after="0" w:line="269" w:lineRule="auto"/>
+              <w:jc w:val="center"/>
+              <w:rPr>
+                <w:rFonts w:hint="eastAsia" w:ascii="宋体" w:hAnsi="宋体" w:eastAsia="宋体" w:cs="宋体"/>
+              </w:rPr>
+            </w:pPr>
+            <w:r>
+              <w:rPr>
+                <w:rFonts w:hint="eastAsia" w:ascii="宋体" w:hAnsi="宋体" w:eastAsia="宋体" w:cs="宋体"/>
                 <w:b w:val="0"/>
                 <w:color w:val="000000"/>
                 <w:sz w:val="16"/>
@@ -1147,35 +1428,7 @@
         </w:trPr>
         <w:tc>
           <w:tcPr>
-            <w:tcW w:w="1814" w:type="dxa"/>
-            <w:shd w:val="clear" w:color="auto" w:fill="FFFFFF"/>
-            <w:tcMar>
-              <w:top w:w="100" w:type="dxa"/>
-              <w:left w:w="100" w:type="dxa"/>
-              <w:bottom w:w="100" w:type="dxa"/>
-              <w:right w:w="100" w:type="dxa"/>
-            </w:tcMar>
-            <w:vAlign w:val="center"/>
-          </w:tcPr>
-          <w:p>
-            <w:pPr>
-              <w:spacing w:before="0" w:after="0" w:line="269" w:lineRule="auto"/>
-              <w:jc w:val="left"/>
-            </w:pPr>
-            <w:r>
-              <w:rPr>
-                <w:rFonts w:ascii="微软雅黑" w:hAnsi="微软雅黑" w:eastAsia="微软雅黑"/>
-                <w:b w:val="0"/>
-                <w:color w:val="000000"/>
-                <w:sz w:val="16"/>
-              </w:rPr>
-              <w:t>CPU FFBP</w:t>
-            </w:r>
-          </w:p>
-        </w:tc>
-        <w:tc>
-          <w:tcPr>
-            <w:tcW w:w="1531" w:type="dxa"/>
+            <w:tcW w:w="1847" w:type="dxa"/>
             <w:shd w:val="clear" w:color="auto" w:fill="FFFFFF"/>
             <w:tcMar>
               <w:top w:w="100" w:type="dxa"/>
@@ -1189,49 +1442,24 @@
             <w:pPr>
               <w:spacing w:before="0" w:after="0" w:line="269" w:lineRule="auto"/>
               <w:jc w:val="center"/>
+              <w:rPr>
+                <w:rFonts w:hint="eastAsia" w:ascii="宋体" w:hAnsi="宋体" w:eastAsia="宋体" w:cs="宋体"/>
+              </w:rPr>
             </w:pPr>
             <w:r>
               <w:rPr>
-                <w:rFonts w:ascii="微软雅黑" w:hAnsi="微软雅黑" w:eastAsia="微软雅黑"/>
+                <w:rFonts w:hint="eastAsia" w:ascii="宋体" w:hAnsi="宋体" w:eastAsia="宋体" w:cs="宋体"/>
                 <w:b w:val="0"/>
                 <w:color w:val="000000"/>
                 <w:sz w:val="16"/>
               </w:rPr>
-              <w:t>538.205 ms</w:t>
+              <w:t>CPU FFBP</w:t>
             </w:r>
           </w:p>
         </w:tc>
         <w:tc>
           <w:tcPr>
-            <w:tcW w:w="1531" w:type="dxa"/>
-            <w:shd w:val="clear" w:color="auto" w:fill="FFFFFF"/>
-            <w:tcMar>
-              <w:top w:w="100" w:type="dxa"/>
-              <w:left w:w="100" w:type="dxa"/>
-              <w:bottom w:w="100" w:type="dxa"/>
-              <w:right w:w="100" w:type="dxa"/>
-            </w:tcMar>
-            <w:vAlign w:val="center"/>
-          </w:tcPr>
-          <w:p>
-            <w:pPr>
-              <w:spacing w:before="0" w:after="0" w:line="269" w:lineRule="auto"/>
-              <w:jc w:val="left"/>
-            </w:pPr>
-            <w:r>
-              <w:rPr>
-                <w:rFonts w:ascii="微软雅黑" w:hAnsi="微软雅黑" w:eastAsia="微软雅黑"/>
-                <w:b w:val="0"/>
-                <w:color w:val="000000"/>
-                <w:sz w:val="16"/>
-              </w:rPr>
-              <w:t>CPU直接BP</w:t>
-            </w:r>
-          </w:p>
-        </w:tc>
-        <w:tc>
-          <w:tcPr>
-            <w:tcW w:w="1701" w:type="dxa"/>
+            <w:tcW w:w="1560" w:type="dxa"/>
             <w:shd w:val="clear" w:color="auto" w:fill="FFFFFF"/>
             <w:tcMar>
               <w:top w:w="100" w:type="dxa"/>
@@ -1245,21 +1473,24 @@
             <w:pPr>
               <w:spacing w:before="0" w:after="0" w:line="269" w:lineRule="auto"/>
               <w:jc w:val="center"/>
+              <w:rPr>
+                <w:rFonts w:hint="eastAsia" w:ascii="宋体" w:hAnsi="宋体" w:eastAsia="宋体" w:cs="宋体"/>
+              </w:rPr>
             </w:pPr>
             <w:r>
               <w:rPr>
-                <w:rFonts w:ascii="微软雅黑" w:hAnsi="微软雅黑" w:eastAsia="微软雅黑"/>
+                <w:rFonts w:hint="eastAsia" w:ascii="宋体" w:hAnsi="宋体" w:eastAsia="宋体" w:cs="宋体"/>
                 <w:b w:val="0"/>
                 <w:color w:val="000000"/>
                 <w:sz w:val="16"/>
               </w:rPr>
-              <w:t>3.2858%</w:t>
+              <w:t>538.205 ms</w:t>
             </w:r>
           </w:p>
         </w:tc>
         <w:tc>
           <w:tcPr>
-            <w:tcW w:w="1247" w:type="dxa"/>
+            <w:tcW w:w="1582" w:type="dxa"/>
             <w:shd w:val="clear" w:color="auto" w:fill="FFFFFF"/>
             <w:tcMar>
               <w:top w:w="100" w:type="dxa"/>
@@ -1273,21 +1504,24 @@
             <w:pPr>
               <w:spacing w:before="0" w:after="0" w:line="269" w:lineRule="auto"/>
               <w:jc w:val="center"/>
+              <w:rPr>
+                <w:rFonts w:hint="eastAsia" w:ascii="宋体" w:hAnsi="宋体" w:eastAsia="宋体" w:cs="宋体"/>
+              </w:rPr>
             </w:pPr>
             <w:r>
               <w:rPr>
-                <w:rFonts w:ascii="微软雅黑" w:hAnsi="微软雅黑" w:eastAsia="微软雅黑"/>
+                <w:rFonts w:hint="eastAsia" w:ascii="宋体" w:hAnsi="宋体" w:eastAsia="宋体" w:cs="宋体"/>
                 <w:b w:val="0"/>
                 <w:color w:val="000000"/>
                 <w:sz w:val="16"/>
               </w:rPr>
-              <w:t>29.67</w:t>
+              <w:t>CPU直接BP</w:t>
             </w:r>
           </w:p>
         </w:tc>
         <w:tc>
           <w:tcPr>
-            <w:tcW w:w="1304" w:type="dxa"/>
+            <w:tcW w:w="1663" w:type="dxa"/>
             <w:shd w:val="clear" w:color="auto" w:fill="FFFFFF"/>
             <w:tcMar>
               <w:top w:w="100" w:type="dxa"/>
@@ -1301,10 +1535,75 @@
             <w:pPr>
               <w:spacing w:before="0" w:after="0" w:line="269" w:lineRule="auto"/>
               <w:jc w:val="center"/>
+              <w:rPr>
+                <w:rFonts w:hint="eastAsia" w:ascii="宋体" w:hAnsi="宋体" w:eastAsia="宋体" w:cs="宋体"/>
+              </w:rPr>
             </w:pPr>
             <w:r>
               <w:rPr>
-                <w:rFonts w:ascii="微软雅黑" w:hAnsi="微软雅黑" w:eastAsia="微软雅黑"/>
+                <w:rFonts w:hint="eastAsia" w:ascii="宋体" w:hAnsi="宋体" w:eastAsia="宋体" w:cs="宋体"/>
+                <w:b w:val="0"/>
+                <w:color w:val="000000"/>
+                <w:sz w:val="16"/>
+              </w:rPr>
+              <w:t>3.2858%</w:t>
+            </w:r>
+          </w:p>
+        </w:tc>
+        <w:tc>
+          <w:tcPr>
+            <w:tcW w:w="1663" w:type="dxa"/>
+            <w:shd w:val="clear" w:color="auto" w:fill="FFFFFF"/>
+            <w:tcMar>
+              <w:top w:w="100" w:type="dxa"/>
+              <w:left w:w="100" w:type="dxa"/>
+              <w:bottom w:w="100" w:type="dxa"/>
+              <w:right w:w="100" w:type="dxa"/>
+            </w:tcMar>
+            <w:vAlign w:val="center"/>
+          </w:tcPr>
+          <w:p>
+            <w:pPr>
+              <w:spacing w:before="0" w:after="0" w:line="269" w:lineRule="auto"/>
+              <w:jc w:val="center"/>
+              <w:rPr>
+                <w:rFonts w:hint="eastAsia" w:ascii="宋体" w:hAnsi="宋体" w:eastAsia="宋体" w:cs="宋体"/>
+              </w:rPr>
+            </w:pPr>
+            <w:r>
+              <w:rPr>
+                <w:rFonts w:hint="eastAsia" w:ascii="宋体" w:hAnsi="宋体" w:eastAsia="宋体" w:cs="宋体"/>
+                <w:b w:val="0"/>
+                <w:color w:val="000000"/>
+                <w:sz w:val="16"/>
+              </w:rPr>
+              <w:t>29.67</w:t>
+            </w:r>
+          </w:p>
+        </w:tc>
+        <w:tc>
+          <w:tcPr>
+            <w:tcW w:w="1663" w:type="dxa"/>
+            <w:shd w:val="clear" w:color="auto" w:fill="FFFFFF"/>
+            <w:tcMar>
+              <w:top w:w="100" w:type="dxa"/>
+              <w:left w:w="100" w:type="dxa"/>
+              <w:bottom w:w="100" w:type="dxa"/>
+              <w:right w:w="100" w:type="dxa"/>
+            </w:tcMar>
+            <w:vAlign w:val="center"/>
+          </w:tcPr>
+          <w:p>
+            <w:pPr>
+              <w:spacing w:before="0" w:after="0" w:line="269" w:lineRule="auto"/>
+              <w:jc w:val="center"/>
+              <w:rPr>
+                <w:rFonts w:hint="eastAsia" w:ascii="宋体" w:hAnsi="宋体" w:eastAsia="宋体" w:cs="宋体"/>
+              </w:rPr>
+            </w:pPr>
+            <w:r>
+              <w:rPr>
+                <w:rFonts w:hint="eastAsia" w:ascii="宋体" w:hAnsi="宋体" w:eastAsia="宋体" w:cs="宋体"/>
                 <w:b w:val="0"/>
                 <w:color w:val="000000"/>
                 <w:sz w:val="16"/>
@@ -1337,35 +1636,7 @@
         </w:trPr>
         <w:tc>
           <w:tcPr>
-            <w:tcW w:w="1814" w:type="dxa"/>
-            <w:shd w:val="clear" w:color="auto" w:fill="FFFFFF"/>
-            <w:tcMar>
-              <w:top w:w="100" w:type="dxa"/>
-              <w:left w:w="100" w:type="dxa"/>
-              <w:bottom w:w="100" w:type="dxa"/>
-              <w:right w:w="100" w:type="dxa"/>
-            </w:tcMar>
-            <w:vAlign w:val="center"/>
-          </w:tcPr>
-          <w:p>
-            <w:pPr>
-              <w:spacing w:before="0" w:after="0" w:line="269" w:lineRule="auto"/>
-              <w:jc w:val="left"/>
-            </w:pPr>
-            <w:r>
-              <w:rPr>
-                <w:rFonts w:ascii="微软雅黑" w:hAnsi="微软雅黑" w:eastAsia="微软雅黑"/>
-                <w:b w:val="0"/>
-                <w:color w:val="000000"/>
-                <w:sz w:val="16"/>
-              </w:rPr>
-              <w:t>GPU FFBP 固定混合</w:t>
-            </w:r>
-          </w:p>
-        </w:tc>
-        <w:tc>
-          <w:tcPr>
-            <w:tcW w:w="1531" w:type="dxa"/>
+            <w:tcW w:w="1847" w:type="dxa"/>
             <w:shd w:val="clear" w:color="auto" w:fill="FFFFFF"/>
             <w:tcMar>
               <w:top w:w="100" w:type="dxa"/>
@@ -1379,49 +1650,24 @@
             <w:pPr>
               <w:spacing w:before="0" w:after="0" w:line="269" w:lineRule="auto"/>
               <w:jc w:val="center"/>
+              <w:rPr>
+                <w:rFonts w:hint="eastAsia" w:ascii="宋体" w:hAnsi="宋体" w:eastAsia="宋体" w:cs="宋体"/>
+              </w:rPr>
             </w:pPr>
             <w:r>
               <w:rPr>
-                <w:rFonts w:ascii="微软雅黑" w:hAnsi="微软雅黑" w:eastAsia="微软雅黑"/>
+                <w:rFonts w:hint="eastAsia" w:ascii="宋体" w:hAnsi="宋体" w:eastAsia="宋体" w:cs="宋体"/>
                 <w:b w:val="0"/>
                 <w:color w:val="000000"/>
                 <w:sz w:val="16"/>
               </w:rPr>
-              <w:t>50.085 ms</w:t>
+              <w:t>GPU FFBP 固定混合</w:t>
             </w:r>
           </w:p>
         </w:tc>
         <w:tc>
           <w:tcPr>
-            <w:tcW w:w="1531" w:type="dxa"/>
-            <w:shd w:val="clear" w:color="auto" w:fill="FFFFFF"/>
-            <w:tcMar>
-              <w:top w:w="100" w:type="dxa"/>
-              <w:left w:w="100" w:type="dxa"/>
-              <w:bottom w:w="100" w:type="dxa"/>
-              <w:right w:w="100" w:type="dxa"/>
-            </w:tcMar>
-            <w:vAlign w:val="center"/>
-          </w:tcPr>
-          <w:p>
-            <w:pPr>
-              <w:spacing w:before="0" w:after="0" w:line="269" w:lineRule="auto"/>
-              <w:jc w:val="left"/>
-            </w:pPr>
-            <w:r>
-              <w:rPr>
-                <w:rFonts w:ascii="微软雅黑" w:hAnsi="微软雅黑" w:eastAsia="微软雅黑"/>
-                <w:b w:val="0"/>
-                <w:color w:val="000000"/>
-                <w:sz w:val="16"/>
-              </w:rPr>
-              <w:t>CPU FFBP</w:t>
-            </w:r>
-          </w:p>
-        </w:tc>
-        <w:tc>
-          <w:tcPr>
-            <w:tcW w:w="1701" w:type="dxa"/>
+            <w:tcW w:w="1560" w:type="dxa"/>
             <w:shd w:val="clear" w:color="auto" w:fill="FFFFFF"/>
             <w:tcMar>
               <w:top w:w="100" w:type="dxa"/>
@@ -1435,31 +1681,24 @@
             <w:pPr>
               <w:spacing w:before="0" w:after="0" w:line="269" w:lineRule="auto"/>
               <w:jc w:val="center"/>
+              <w:rPr>
+                <w:rFonts w:hint="eastAsia" w:ascii="宋体" w:hAnsi="宋体" w:eastAsia="宋体" w:cs="宋体"/>
+              </w:rPr>
             </w:pPr>
             <w:r>
               <w:rPr>
-                <w:rFonts w:ascii="微软雅黑" w:hAnsi="微软雅黑" w:eastAsia="微软雅黑"/>
+                <w:rFonts w:hint="eastAsia" w:ascii="宋体" w:hAnsi="宋体" w:eastAsia="宋体" w:cs="宋体"/>
                 <w:b w:val="0"/>
                 <w:color w:val="000000"/>
                 <w:sz w:val="16"/>
               </w:rPr>
-              <w:t>2.040×10</w:t>
-            </w:r>
-            <w:r>
-              <w:rPr>
-                <w:rFonts w:ascii="微软雅黑" w:hAnsi="微软雅黑" w:eastAsia="微软雅黑"/>
-                <w:b w:val="0"/>
-                <w:color w:val="000000"/>
-                <w:sz w:val="16"/>
-                <w:vertAlign w:val="superscript"/>
-              </w:rPr>
-              <w:t>-7</w:t>
+              <w:t>50.085 ms</w:t>
             </w:r>
           </w:p>
         </w:tc>
         <w:tc>
           <w:tcPr>
-            <w:tcW w:w="1247" w:type="dxa"/>
+            <w:tcW w:w="1582" w:type="dxa"/>
             <w:shd w:val="clear" w:color="auto" w:fill="FFFFFF"/>
             <w:tcMar>
               <w:top w:w="100" w:type="dxa"/>
@@ -1473,21 +1712,24 @@
             <w:pPr>
               <w:spacing w:before="0" w:after="0" w:line="269" w:lineRule="auto"/>
               <w:jc w:val="center"/>
+              <w:rPr>
+                <w:rFonts w:hint="eastAsia" w:ascii="宋体" w:hAnsi="宋体" w:eastAsia="宋体" w:cs="宋体"/>
+              </w:rPr>
             </w:pPr>
             <w:r>
               <w:rPr>
-                <w:rFonts w:ascii="微软雅黑" w:hAnsi="微软雅黑" w:eastAsia="微软雅黑"/>
+                <w:rFonts w:hint="eastAsia" w:ascii="宋体" w:hAnsi="宋体" w:eastAsia="宋体" w:cs="宋体"/>
                 <w:b w:val="0"/>
                 <w:color w:val="000000"/>
                 <w:sz w:val="16"/>
               </w:rPr>
-              <w:t>133.81</w:t>
+              <w:t>CPU FFBP</w:t>
             </w:r>
           </w:p>
         </w:tc>
         <w:tc>
           <w:tcPr>
-            <w:tcW w:w="1304" w:type="dxa"/>
+            <w:tcW w:w="1663" w:type="dxa"/>
             <w:shd w:val="clear" w:color="auto" w:fill="FFFFFF"/>
             <w:tcMar>
               <w:top w:w="100" w:type="dxa"/>
@@ -1501,10 +1743,85 @@
             <w:pPr>
               <w:spacing w:before="0" w:after="0" w:line="269" w:lineRule="auto"/>
               <w:jc w:val="center"/>
+              <w:rPr>
+                <w:rFonts w:hint="eastAsia" w:ascii="宋体" w:hAnsi="宋体" w:eastAsia="宋体" w:cs="宋体"/>
+              </w:rPr>
             </w:pPr>
             <w:r>
               <w:rPr>
-                <w:rFonts w:ascii="微软雅黑" w:hAnsi="微软雅黑" w:eastAsia="微软雅黑"/>
+                <w:rFonts w:hint="eastAsia" w:ascii="宋体" w:hAnsi="宋体" w:eastAsia="宋体" w:cs="宋体"/>
+                <w:b w:val="0"/>
+                <w:color w:val="000000"/>
+                <w:sz w:val="16"/>
+              </w:rPr>
+              <w:t>2.040×10</w:t>
+            </w:r>
+            <w:r>
+              <w:rPr>
+                <w:rFonts w:hint="eastAsia" w:ascii="宋体" w:hAnsi="宋体" w:eastAsia="宋体" w:cs="宋体"/>
+                <w:b w:val="0"/>
+                <w:color w:val="000000"/>
+                <w:sz w:val="16"/>
+                <w:vertAlign w:val="superscript"/>
+              </w:rPr>
+              <w:t>-7</w:t>
+            </w:r>
+          </w:p>
+        </w:tc>
+        <w:tc>
+          <w:tcPr>
+            <w:tcW w:w="1663" w:type="dxa"/>
+            <w:shd w:val="clear" w:color="auto" w:fill="FFFFFF"/>
+            <w:tcMar>
+              <w:top w:w="100" w:type="dxa"/>
+              <w:left w:w="100" w:type="dxa"/>
+              <w:bottom w:w="100" w:type="dxa"/>
+              <w:right w:w="100" w:type="dxa"/>
+            </w:tcMar>
+            <w:vAlign w:val="center"/>
+          </w:tcPr>
+          <w:p>
+            <w:pPr>
+              <w:spacing w:before="0" w:after="0" w:line="269" w:lineRule="auto"/>
+              <w:jc w:val="center"/>
+              <w:rPr>
+                <w:rFonts w:hint="eastAsia" w:ascii="宋体" w:hAnsi="宋体" w:eastAsia="宋体" w:cs="宋体"/>
+              </w:rPr>
+            </w:pPr>
+            <w:r>
+              <w:rPr>
+                <w:rFonts w:hint="eastAsia" w:ascii="宋体" w:hAnsi="宋体" w:eastAsia="宋体" w:cs="宋体"/>
+                <w:b w:val="0"/>
+                <w:color w:val="000000"/>
+                <w:sz w:val="16"/>
+              </w:rPr>
+              <w:t>133.81</w:t>
+            </w:r>
+          </w:p>
+        </w:tc>
+        <w:tc>
+          <w:tcPr>
+            <w:tcW w:w="1663" w:type="dxa"/>
+            <w:shd w:val="clear" w:color="auto" w:fill="FFFFFF"/>
+            <w:tcMar>
+              <w:top w:w="100" w:type="dxa"/>
+              <w:left w:w="100" w:type="dxa"/>
+              <w:bottom w:w="100" w:type="dxa"/>
+              <w:right w:w="100" w:type="dxa"/>
+            </w:tcMar>
+            <w:vAlign w:val="center"/>
+          </w:tcPr>
+          <w:p>
+            <w:pPr>
+              <w:spacing w:before="0" w:after="0" w:line="269" w:lineRule="auto"/>
+              <w:jc w:val="center"/>
+              <w:rPr>
+                <w:rFonts w:hint="eastAsia" w:ascii="宋体" w:hAnsi="宋体" w:eastAsia="宋体" w:cs="宋体"/>
+              </w:rPr>
+            </w:pPr>
+            <w:r>
+              <w:rPr>
+                <w:rFonts w:hint="eastAsia" w:ascii="宋体" w:hAnsi="宋体" w:eastAsia="宋体" w:cs="宋体"/>
                 <w:b w:val="0"/>
                 <w:color w:val="000000"/>
                 <w:sz w:val="16"/>
@@ -1518,46 +1835,216 @@
     <w:p>
       <w:pPr>
         <w:keepLines/>
-        <w:ind w:firstLine="420"/>
-      </w:pPr>
-      <w:r>
         <w:rPr>
           <w:rFonts w:ascii="宋体" w:hAnsi="宋体" w:eastAsia="宋体"/>
           <w:color w:val="000000"/>
           <w:sz w:val="21"/>
         </w:rPr>
-        <w:t>GPU相对CPU的同算法加速比分别为16.68×（直接BP）和10.75×（FFBP）。同一设备上，FFBP相对直接BP的加速比为18.95×（CPU）和12.21×（GPU）。GPU FFBP相对CPU直接BP达到203.66×，但其相对CPU直接BP的总SER为29.67 dB，因此该倍率不属于等质量加速。</w:t>
+      </w:pPr>
+    </w:p>
+    <w:p>
+      <w:pPr>
+        <w:pStyle w:val="15"/>
+        <w:keepNext w:val="0"/>
+        <w:keepLines/>
+        <w:pageBreakBefore w:val="0"/>
+        <w:widowControl/>
+        <w:kinsoku/>
+        <w:wordWrap/>
+        <w:overflowPunct/>
+        <w:topLinePunct w:val="0"/>
+        <w:autoSpaceDE/>
+        <w:autoSpaceDN/>
+        <w:bidi w:val="0"/>
+        <w:adjustRightInd/>
+        <w:snapToGrid/>
+        <w:spacing w:after="140" w:line="360" w:lineRule="auto"/>
+        <w:ind w:firstLine="420" w:firstLineChars="200"/>
+        <w:textAlignment w:val="auto"/>
+        <w:rPr>
+          <w:rFonts w:hint="eastAsia" w:ascii="宋体" w:hAnsi="宋体" w:eastAsia="宋体" w:cs="宋体"/>
+          <w:color w:val="000000"/>
+          <w:sz w:val="21"/>
+          <w:szCs w:val="21"/>
+        </w:rPr>
+      </w:pPr>
+      <w:r>
+        <w:rPr>
+          <w:rFonts w:hint="eastAsia" w:ascii="宋体" w:hAnsi="宋体" w:eastAsia="宋体" w:cs="宋体"/>
+          <w:color w:val="000000"/>
+          <w:sz w:val="21"/>
+          <w:szCs w:val="21"/>
+        </w:rPr>
+        <w:t>GPU相对CPU的同算法加速比分别为16.68</w:t>
+      </w:r>
+      <w:r>
+        <w:rPr>
+          <w:rFonts w:hint="eastAsia" w:ascii="宋体" w:hAnsi="宋体" w:eastAsia="宋体" w:cs="宋体"/>
+          <w:color w:val="000000"/>
+          <w:sz w:val="21"/>
+          <w:szCs w:val="21"/>
+          <w:lang w:val="en-US" w:eastAsia="zh-CN"/>
+        </w:rPr>
+        <w:t>x</w:t>
+      </w:r>
+      <w:r>
+        <w:rPr>
+          <w:rFonts w:hint="eastAsia" w:ascii="宋体" w:hAnsi="宋体" w:eastAsia="宋体" w:cs="宋体"/>
+          <w:color w:val="000000"/>
+          <w:sz w:val="21"/>
+          <w:szCs w:val="21"/>
+        </w:rPr>
+        <w:t>（直接BP）和10.75</w:t>
+      </w:r>
+      <w:r>
+        <w:rPr>
+          <w:rFonts w:hint="eastAsia" w:ascii="宋体" w:hAnsi="宋体" w:eastAsia="宋体" w:cs="宋体"/>
+          <w:color w:val="000000"/>
+          <w:sz w:val="21"/>
+          <w:szCs w:val="21"/>
+          <w:lang w:val="en-US" w:eastAsia="zh-CN"/>
+        </w:rPr>
+        <w:t>x</w:t>
+      </w:r>
+      <w:r>
+        <w:rPr>
+          <w:rFonts w:hint="eastAsia" w:ascii="宋体" w:hAnsi="宋体" w:eastAsia="宋体" w:cs="宋体"/>
+          <w:color w:val="000000"/>
+          <w:sz w:val="21"/>
+          <w:szCs w:val="21"/>
+        </w:rPr>
+        <w:t>（FFBP）。同一设备上，FFBP相对直接BP的加速比为18.95</w:t>
+      </w:r>
+      <w:r>
+        <w:rPr>
+          <w:rFonts w:hint="eastAsia" w:ascii="宋体" w:hAnsi="宋体" w:eastAsia="宋体" w:cs="宋体"/>
+          <w:color w:val="000000"/>
+          <w:sz w:val="21"/>
+          <w:szCs w:val="21"/>
+          <w:lang w:val="en-US" w:eastAsia="zh-CN"/>
+        </w:rPr>
+        <w:t>x(</w:t>
+      </w:r>
+      <w:r>
+        <w:rPr>
+          <w:rFonts w:hint="eastAsia" w:ascii="宋体" w:hAnsi="宋体" w:eastAsia="宋体" w:cs="宋体"/>
+          <w:color w:val="000000"/>
+          <w:sz w:val="21"/>
+          <w:szCs w:val="21"/>
+        </w:rPr>
+        <w:t>CPU</w:t>
+      </w:r>
+      <w:r>
+        <w:rPr>
+          <w:rFonts w:hint="eastAsia" w:ascii="宋体" w:hAnsi="宋体" w:eastAsia="宋体" w:cs="宋体"/>
+          <w:color w:val="000000"/>
+          <w:sz w:val="21"/>
+          <w:szCs w:val="21"/>
+          <w:lang w:val="en-US" w:eastAsia="zh-CN"/>
+        </w:rPr>
+        <w:t>)</w:t>
+      </w:r>
+      <w:r>
+        <w:rPr>
+          <w:rFonts w:hint="eastAsia" w:ascii="宋体" w:hAnsi="宋体" w:eastAsia="宋体" w:cs="宋体"/>
+          <w:color w:val="000000"/>
+          <w:sz w:val="21"/>
+          <w:szCs w:val="21"/>
+        </w:rPr>
+        <w:t>和12.21</w:t>
+      </w:r>
+      <w:r>
+        <w:rPr>
+          <w:rFonts w:hint="eastAsia" w:ascii="宋体" w:hAnsi="宋体" w:eastAsia="宋体" w:cs="宋体"/>
+          <w:color w:val="000000"/>
+          <w:sz w:val="21"/>
+          <w:szCs w:val="21"/>
+          <w:lang w:val="en-US" w:eastAsia="zh-CN"/>
+        </w:rPr>
+        <w:t>x(</w:t>
+      </w:r>
+      <w:r>
+        <w:rPr>
+          <w:rFonts w:hint="eastAsia" w:ascii="宋体" w:hAnsi="宋体" w:eastAsia="宋体" w:cs="宋体"/>
+          <w:color w:val="000000"/>
+          <w:sz w:val="21"/>
+          <w:szCs w:val="21"/>
+        </w:rPr>
+        <w:t>GPU</w:t>
+      </w:r>
+      <w:r>
+        <w:rPr>
+          <w:rFonts w:hint="eastAsia" w:ascii="宋体" w:hAnsi="宋体" w:eastAsia="宋体" w:cs="宋体"/>
+          <w:color w:val="000000"/>
+          <w:sz w:val="21"/>
+          <w:szCs w:val="21"/>
+          <w:lang w:val="en-US" w:eastAsia="zh-CN"/>
+        </w:rPr>
+        <w:t>)</w:t>
+      </w:r>
+      <w:r>
+        <w:rPr>
+          <w:rFonts w:hint="eastAsia" w:ascii="宋体" w:hAnsi="宋体" w:eastAsia="宋体" w:cs="宋体"/>
+          <w:color w:val="000000"/>
+          <w:sz w:val="21"/>
+          <w:szCs w:val="21"/>
+        </w:rPr>
+        <w:t>。GPU FFBP相对CPU直接BP达到203.66</w:t>
+      </w:r>
+      <w:r>
+        <w:rPr>
+          <w:rFonts w:hint="eastAsia" w:ascii="宋体" w:hAnsi="宋体" w:eastAsia="宋体" w:cs="宋体"/>
+          <w:color w:val="000000"/>
+          <w:sz w:val="21"/>
+          <w:szCs w:val="21"/>
+          <w:lang w:val="en-US" w:eastAsia="zh-CN"/>
+        </w:rPr>
+        <w:t>x</w:t>
+      </w:r>
+      <w:r>
+        <w:rPr>
+          <w:rFonts w:hint="eastAsia" w:ascii="宋体" w:hAnsi="宋体" w:eastAsia="宋体" w:cs="宋体"/>
+          <w:color w:val="000000"/>
+          <w:sz w:val="21"/>
+          <w:szCs w:val="21"/>
+        </w:rPr>
+        <w:t>，但其相对CPU直接BP的总SER为29.67 dB，因此该倍率不属于等质量加速。</w:t>
       </w:r>
     </w:p>
     <w:p>
       <w:pPr>
+        <w:pStyle w:val="15"/>
+        <w:keepNext w:val="0"/>
         <w:keepLines/>
-        <w:ind w:firstLine="420"/>
+        <w:pageBreakBefore w:val="0"/>
+        <w:widowControl/>
+        <w:kinsoku/>
+        <w:wordWrap/>
+        <w:overflowPunct/>
+        <w:topLinePunct w:val="0"/>
+        <w:autoSpaceDE/>
+        <w:autoSpaceDN/>
+        <w:bidi w:val="0"/>
+        <w:adjustRightInd/>
+        <w:snapToGrid/>
+        <w:spacing w:after="140" w:line="360" w:lineRule="auto"/>
+        <w:ind w:firstLine="420" w:firstLineChars="200"/>
+        <w:textAlignment w:val="auto"/>
+        <w:rPr>
+          <w:rFonts w:hint="eastAsia" w:ascii="宋体" w:hAnsi="宋体" w:eastAsia="宋体" w:cs="宋体"/>
+          <w:color w:val="000000"/>
+          <w:sz w:val="21"/>
+          <w:szCs w:val="21"/>
+        </w:rPr>
       </w:pPr>
       <w:r>
         <w:rPr>
-          <w:rFonts w:ascii="宋体" w:hAnsi="宋体" w:eastAsia="宋体"/>
+          <w:rFonts w:hint="eastAsia" w:ascii="宋体" w:hAnsi="宋体" w:eastAsia="宋体" w:cs="宋体"/>
           <w:color w:val="000000"/>
           <w:sz w:val="21"/>
+          <w:szCs w:val="21"/>
         </w:rPr>
-        <w:t>GPU直接BP与GPU FFBP对各自CPU参考的误差均低于2×10</w:t>
-      </w:r>
-      <w:r>
-        <w:rPr>
-          <w:rFonts w:ascii="宋体" w:hAnsi="宋体" w:eastAsia="宋体"/>
-          <w:color w:val="000000"/>
-          <w:sz w:val="21"/>
-          <w:vertAlign w:val="superscript"/>
-        </w:rPr>
-        <w:t>-6</w:t>
-      </w:r>
-      <w:r>
-        <w:rPr>
-          <w:rFonts w:ascii="宋体" w:hAnsi="宋体" w:eastAsia="宋体"/>
-          <w:color w:val="000000"/>
-          <w:sz w:val="21"/>
-        </w:rPr>
-        <w:t>，说明CUDA实现保持了既定成像算子。CPU FFBP相对CPU直接BP的3.29%复误差反映因子分解和局部网格重采样的算法近似。</w:t>
+        <w:t>GPU直接BP与GPU FFBP对各自CPU参考的误差均低于2×10-6，说明CUDA实现保持了既定成像算子。CPU FFBP相对CPU直接BP的3.29%复误差反映因子分解和局部网格重采样的算法近似。</w:t>
       </w:r>
     </w:p>
     <w:p>
@@ -1616,23 +2103,65 @@
         <w:pStyle w:val="15"/>
         <w:keepLines/>
         <w:spacing w:after="140"/>
+        <w:jc w:val="center"/>
+        <w:rPr>
+          <w:rFonts w:hint="eastAsia" w:ascii="宋体" w:hAnsi="宋体" w:eastAsia="宋体" w:cs="宋体"/>
+          <w:b w:val="0"/>
+          <w:bCs w:val="0"/>
+          <w:color w:val="000000"/>
+          <w:sz w:val="18"/>
+        </w:rPr>
       </w:pPr>
       <w:r>
         <w:rPr>
-          <w:rFonts w:ascii="微软雅黑" w:hAnsi="微软雅黑" w:eastAsia="微软雅黑"/>
-          <w:b/>
+          <w:rFonts w:hint="eastAsia" w:ascii="宋体" w:hAnsi="宋体" w:eastAsia="宋体" w:cs="宋体"/>
+          <w:b w:val="0"/>
+          <w:bCs w:val="0"/>
           <w:color w:val="000000"/>
           <w:sz w:val="18"/>
         </w:rPr>
-        <w:t xml:space="preserve">图3 </w:t>
+        <w:t>图3 四种基线的核心成像时间</w:t>
+      </w:r>
+    </w:p>
+    <w:p>
+      <w:pPr>
+        <w:keepLines/>
+        <w:ind w:firstLine="420" w:firstLineChars="200"/>
+      </w:pPr>
+      <w:r>
+        <w:rPr>
+          <w:rFonts w:ascii="宋体" w:hAnsi="宋体" w:eastAsia="宋体"/>
+          <w:color w:val="000000"/>
+          <w:sz w:val="21"/>
+        </w:rPr>
+        <w:t>GPU时间不含文件读取、H2D和D2H</w:t>
       </w:r>
       <w:r>
         <w:rPr>
-          <w:rFonts w:ascii="微软雅黑" w:hAnsi="微软雅黑" w:eastAsia="微软雅黑"/>
+          <w:rFonts w:hint="eastAsia"/>
           <w:color w:val="000000"/>
-          <w:sz w:val="18"/>
+          <w:sz w:val="21"/>
+          <w:lang w:eastAsia="zh-CN"/>
         </w:rPr>
-        <w:t>四种基线的核心成像时间，纵轴为对数尺度。GPU时间不含文件读取、H2D和D2H；该口径对应多区域、多帧或参数扫描时复用显存中数据的计算场景。</w:t>
+        <w:t>。</w:t>
+      </w:r>
+      <w:r>
+        <w:rPr>
+          <w:rFonts w:ascii="宋体" w:hAnsi="宋体" w:eastAsia="宋体"/>
+          <w:color w:val="000000"/>
+          <w:sz w:val="21"/>
+        </w:rPr>
+        <w:t>该口径对应多区域、多帧或参数扫描时复用显存中数据的计算场景。固定混合精度GPU复现了同算法CPU结果：直接BP和FFBP的驻留计算时间分别由10.201 s、538.205 ms降至611.359 ms、50.085 ms。FFBP的主</w:t>
+      </w:r>
+      <w:bookmarkStart w:id="0" w:name="_GoBack"/>
+      <w:bookmarkEnd w:id="0"/>
+      <w:r>
+        <w:rPr>
+          <w:rFonts w:ascii="宋体" w:hAnsi="宋体" w:eastAsia="宋体"/>
+          <w:color w:val="000000"/>
+          <w:sz w:val="21"/>
+        </w:rPr>
+        <w:t>要误差来自分解与重采样近似，而非GPU移植。</w:t>
       </w:r>
     </w:p>
     <w:p>
@@ -1646,21 +2175,24 @@
           <w:color w:val="000000"/>
           <w:sz w:val="21"/>
         </w:rPr>
-        <w:t>固定混合精度GPU复现了同算法CPU结果：直接BP和FFBP的驻留计算时间分别由10.201 s、538.205 ms降至611.359 ms、50.085 ms。FFBP的主要误差来自分解与重采样近似，而非GPU移植。</w:t>
+        <w:t>若计入单次H2D和D2H，GPU直接BP为1628.993 ms，仍比CPU快6.26</w:t>
       </w:r>
-    </w:p>
-    <w:p>
-      <w:pPr>
-        <w:keepLines/>
-        <w:ind w:firstLine="420"/>
-      </w:pPr>
+      <w:r>
+        <w:rPr>
+          <w:rFonts w:hint="eastAsia"/>
+          <w:color w:val="000000"/>
+          <w:sz w:val="21"/>
+          <w:lang w:val="en-US" w:eastAsia="zh-CN"/>
+        </w:rPr>
+        <w:t>x</w:t>
+      </w:r>
       <w:r>
         <w:rPr>
           <w:rFonts w:ascii="宋体" w:hAnsi="宋体" w:eastAsia="宋体"/>
           <w:color w:val="000000"/>
           <w:sz w:val="21"/>
         </w:rPr>
-        <w:t>若计入单次H2D和D2H，GPU直接BP为1628.993 ms，仍比CPU快6.26×；GPU FFBP为1067.767 ms，慢于CPU FFBP的538.205 ms。纯FP32直接BP为38.050 ms / 48.67 dB，FFBP为45.877 ms / 38.78 dB。</w:t>
+        <w:t>；GPU FFBP为1067.767 ms，慢于CPU FFBP的538.205 ms。纯FP32直接BP为38.050 ms，FFBP为45.877 ms。</w:t>
       </w:r>
     </w:p>
     <w:p>
@@ -1679,12 +2211,20 @@
     </w:p>
     <w:p>
       <w:pPr>
-        <w:pStyle w:val="3"/>
+        <w:pStyle w:val="4"/>
         <w:keepNext/>
         <w:keepLines/>
+        <w:rPr>
+          <w:rFonts w:hint="eastAsia" w:ascii="宋体" w:hAnsi="宋体" w:eastAsia="宋体" w:cs="宋体"/>
+          <w:lang w:val="en-US" w:eastAsia="zh-CN"/>
+        </w:rPr>
       </w:pPr>
       <w:r>
-        <w:t>3 结论</w:t>
+        <w:rPr>
+          <w:rFonts w:hint="eastAsia" w:ascii="宋体" w:hAnsi="宋体" w:eastAsia="宋体" w:cs="宋体"/>
+          <w:lang w:val="en-US" w:eastAsia="zh-CN"/>
+        </w:rPr>
+        <w:t>2 结论</w:t>
       </w:r>
     </w:p>
     <w:p>
@@ -1714,14 +2254,72 @@
           <w:color w:val="000000"/>
           <w:sz w:val="21"/>
         </w:rPr>
-        <w:t>数据常驻条件下，GPU对直接BP和FFBP分别加速16.68×和10.75×；四种配置中GPU FFBP用时最短。</w:t>
+        <w:t>数据常驻条件下，GPU对直接BP和FFBP分别加速16.68</w:t>
+      </w:r>
+      <w:r>
+        <w:rPr>
+          <w:rFonts w:hint="eastAsia"/>
+          <w:color w:val="000000"/>
+          <w:sz w:val="21"/>
+          <w:lang w:val="en-US" w:eastAsia="zh-CN"/>
+        </w:rPr>
+        <w:t>x</w:t>
+      </w:r>
+      <w:r>
+        <w:rPr>
+          <w:rFonts w:ascii="宋体" w:hAnsi="宋体" w:eastAsia="宋体"/>
+          <w:color w:val="000000"/>
+          <w:sz w:val="21"/>
+        </w:rPr>
+        <w:t>和10.75</w:t>
+      </w:r>
+      <w:r>
+        <w:rPr>
+          <w:rFonts w:hint="eastAsia"/>
+          <w:color w:val="000000"/>
+          <w:sz w:val="21"/>
+          <w:lang w:val="en-US" w:eastAsia="zh-CN"/>
+        </w:rPr>
+        <w:t>x</w:t>
+      </w:r>
+      <w:r>
+        <w:rPr>
+          <w:rFonts w:ascii="宋体" w:hAnsi="宋体" w:eastAsia="宋体"/>
+          <w:color w:val="000000"/>
+          <w:sz w:val="21"/>
+        </w:rPr>
+        <w:t>；四种配置中GPU FFBP用时最短。</w:t>
       </w:r>
     </w:p>
     <w:p>
       <w:pPr>
-        <w:pStyle w:val="14"/>
+        <w:pStyle w:val="4"/>
+        <w:keepNext/>
         <w:keepLines/>
-        <w:spacing w:after="60"/>
+        <w:rPr>
+          <w:rFonts w:hint="eastAsia" w:ascii="宋体" w:hAnsi="宋体" w:eastAsia="宋体" w:cs="宋体"/>
+          <w:lang w:val="en-US" w:eastAsia="zh-CN"/>
+        </w:rPr>
+      </w:pPr>
+      <w:r>
+        <w:rPr>
+          <w:rFonts w:hint="eastAsia" w:ascii="宋体" w:hAnsi="宋体" w:eastAsia="宋体" w:cs="宋体"/>
+          <w:lang w:val="en-US" w:eastAsia="zh-CN"/>
+        </w:rPr>
+        <w:t>3 接下来的工作</w:t>
+      </w:r>
+    </w:p>
+    <w:p>
+      <w:pPr>
+        <w:keepLines/>
+        <w:ind w:firstLine="420"/>
+        <w:rPr>
+          <w:rFonts w:ascii="宋体" w:hAnsi="宋体" w:eastAsia="宋体" w:cstheme="minorBidi"/>
+          <w:color w:val="000000"/>
+          <w:sz w:val="21"/>
+          <w:szCs w:val="22"/>
+          <w:lang w:val="en-US" w:eastAsia="en-US" w:bidi="ar-SA"/>
+        </w:rPr>
       </w:pPr>
       <w:r>
         <w:rPr>
@@ -1729,45 +2327,149 @@
           <w:color w:val="000000"/>
           <w:sz w:val="21"/>
         </w:rPr>
-        <w:t>当前质量差异主要由FFBP的分解与重采样决定。后续比较应在相同输出网格和相同误差约束下进行。</w:t>
+        <w:t>下一步</w:t>
+      </w:r>
+      <w:r>
+        <w:rPr>
+          <w:rFonts w:ascii="宋体" w:hAnsi="宋体" w:eastAsia="宋体" w:cs="宋体"/>
+          <w:sz w:val="21"/>
+          <w:szCs w:val="21"/>
+        </w:rPr>
+        <w:t>继续开展</w:t>
+      </w:r>
+      <w:r>
+        <w:rPr>
+          <w:rFonts w:hint="eastAsia" w:ascii="Times New Roman" w:hAnsi="Times New Roman" w:eastAsia="宋体" w:cs="Times New Roman"/>
+          <w:color w:val="000000"/>
+          <w:sz w:val="21"/>
+          <w:szCs w:val="22"/>
+          <w:lang w:val="en-US" w:eastAsia="zh-CN" w:bidi="ar-SA"/>
+        </w:rPr>
+        <w:t>bp</w:t>
+      </w:r>
+      <w:r>
+        <w:rPr>
+          <w:rFonts w:hint="eastAsia" w:ascii="宋体" w:hAnsi="宋体" w:eastAsia="宋体"/>
+          <w:color w:val="000000"/>
+          <w:sz w:val="21"/>
+          <w:lang w:val="en-US" w:eastAsia="zh-CN"/>
+        </w:rPr>
+        <w:t>成像的</w:t>
+      </w:r>
+      <w:r>
+        <w:rPr>
+          <w:rFonts w:hint="eastAsia" w:ascii="Times New Roman" w:hAnsi="Times New Roman" w:eastAsia="宋体" w:cs="Times New Roman"/>
+          <w:color w:val="000000"/>
+          <w:sz w:val="21"/>
+          <w:szCs w:val="22"/>
+          <w:lang w:val="en-US" w:eastAsia="zh-CN" w:bidi="ar-SA"/>
+        </w:rPr>
+        <w:t>gpu</w:t>
+      </w:r>
+      <w:r>
+        <w:rPr>
+          <w:rFonts w:hint="eastAsia"/>
+          <w:color w:val="000000"/>
+          <w:sz w:val="21"/>
+          <w:lang w:val="en-US" w:eastAsia="zh-CN"/>
+        </w:rPr>
+        <w:t>算子</w:t>
+      </w:r>
+      <w:r>
+        <w:rPr>
+          <w:rFonts w:hint="eastAsia" w:ascii="宋体" w:hAnsi="宋体" w:eastAsia="宋体"/>
+          <w:color w:val="000000"/>
+          <w:sz w:val="21"/>
+          <w:lang w:val="en-US" w:eastAsia="zh-CN"/>
+        </w:rPr>
+        <w:t>优化，</w:t>
+      </w:r>
+      <w:r>
+        <w:rPr>
+          <w:rFonts w:ascii="宋体" w:hAnsi="宋体" w:eastAsia="宋体" w:cstheme="minorBidi"/>
+          <w:color w:val="000000"/>
+          <w:sz w:val="21"/>
+          <w:szCs w:val="22"/>
+          <w:lang w:val="en-US" w:eastAsia="en-US" w:bidi="ar-SA"/>
+        </w:rPr>
+        <w:t>使用</w:t>
+      </w:r>
+      <w:r>
+        <w:rPr>
+          <w:rFonts w:hint="default" w:ascii="Times New Roman" w:hAnsi="Times New Roman" w:eastAsia="宋体" w:cs="Times New Roman"/>
+          <w:color w:val="000000"/>
+          <w:sz w:val="21"/>
+          <w:szCs w:val="22"/>
+          <w:lang w:val="en-US" w:eastAsia="en-US" w:bidi="ar-SA"/>
+        </w:rPr>
+        <w:t xml:space="preserve"> Nsight</w:t>
+      </w:r>
+      <w:r>
+        <w:rPr>
+          <w:rFonts w:hint="default" w:ascii="Times New Roman" w:hAnsi="Times New Roman" w:cs="Times New Roman"/>
+          <w:color w:val="000000"/>
+          <w:sz w:val="21"/>
+          <w:szCs w:val="22"/>
+          <w:lang w:val="en-US" w:eastAsia="zh-CN" w:bidi="ar-SA"/>
+        </w:rPr>
+        <w:t xml:space="preserve"> </w:t>
+      </w:r>
+      <w:r>
+        <w:rPr>
+          <w:rFonts w:hint="default" w:ascii="Times New Roman" w:hAnsi="Times New Roman" w:eastAsia="宋体" w:cs="Times New Roman"/>
+          <w:color w:val="000000"/>
+          <w:sz w:val="21"/>
+          <w:szCs w:val="22"/>
+          <w:lang w:val="en-US" w:eastAsia="en-US" w:bidi="ar-SA"/>
+        </w:rPr>
+        <w:t>Systems</w:t>
+      </w:r>
+      <w:r>
+        <w:rPr>
+          <w:rFonts w:ascii="宋体" w:hAnsi="宋体" w:eastAsia="宋体" w:cstheme="minorBidi"/>
+          <w:color w:val="000000"/>
+          <w:sz w:val="21"/>
+          <w:szCs w:val="22"/>
+          <w:lang w:val="en-US" w:eastAsia="en-US" w:bidi="ar-SA"/>
+        </w:rPr>
+        <w:t>分析按层批处理</w:t>
+      </w:r>
+      <w:r>
+        <w:rPr>
+          <w:rFonts w:hint="default" w:ascii="Times New Roman" w:hAnsi="Times New Roman" w:eastAsia="宋体" w:cs="Times New Roman"/>
+          <w:color w:val="000000"/>
+          <w:sz w:val="21"/>
+          <w:szCs w:val="22"/>
+          <w:lang w:val="en-US" w:eastAsia="en-US" w:bidi="ar-SA"/>
+        </w:rPr>
+        <w:t xml:space="preserve"> FFBP</w:t>
+      </w:r>
+      <w:r>
+        <w:rPr>
+          <w:rFonts w:ascii="宋体" w:hAnsi="宋体" w:eastAsia="宋体" w:cstheme="minorBidi"/>
+          <w:color w:val="000000"/>
+          <w:sz w:val="21"/>
+          <w:szCs w:val="22"/>
+          <w:lang w:val="en-US" w:eastAsia="en-US" w:bidi="ar-SA"/>
+        </w:rPr>
+        <w:t>的耗时，定位主要性能瓶颈。</w:t>
       </w:r>
     </w:p>
     <w:p>
       <w:pPr>
-        <w:pStyle w:val="3"/>
+        <w:pStyle w:val="4"/>
         <w:keepNext/>
         <w:keepLines/>
-      </w:pPr>
-      <w:r>
-        <w:t>4 接下来的工作</w:t>
-      </w:r>
-    </w:p>
-    <w:p>
-      <w:pPr>
-        <w:keepLines/>
-        <w:ind w:firstLine="420"/>
+        <w:rPr>
+          <w:rFonts w:hint="eastAsia" w:ascii="宋体" w:hAnsi="宋体" w:eastAsia="宋体" w:cs="宋体"/>
+          <w:lang w:val="en-US" w:eastAsia="zh-CN"/>
+        </w:rPr>
       </w:pPr>
       <w:r>
         <w:rPr>
-          <w:rFonts w:ascii="宋体" w:hAnsi="宋体" w:eastAsia="宋体"/>
-          <w:color w:val="000000"/>
-          <w:sz w:val="21"/>
+          <w:rFonts w:hint="eastAsia" w:ascii="宋体" w:hAnsi="宋体" w:eastAsia="宋体" w:cs="宋体"/>
+          <w:lang w:val="en-US" w:eastAsia="zh-CN"/>
         </w:rPr>
-        <w:t>下一步考虑用Nsight Systems分析按层批处理FFBP的耗时，查明时间主要花在叶节点BP、重采样还是核函数调度上。在相同输出网格下调整叶节点大小、内部采样密度和各层计算精度，比较SER不低于45 dB时的计算速度。成像质量还需结合亮目标相位误差及点目标IRW、PSLR、ISLR判断。实验先使用现有实测数据和点目标仿真，再补充GOTCHA数据及其他型号GPU的对照实验。</w:t>
-      </w:r>
-    </w:p>
-    <w:p>
-      <w:r>
-        <w:br w:type="page"/>
-      </w:r>
-    </w:p>
-    <w:p>
-      <w:pPr>
-        <w:pStyle w:val="3"/>
-        <w:keepNext/>
-        <w:keepLines/>
-      </w:pPr>
-      <w:r>
         <w:t>参考文献</w:t>
       </w:r>
     </w:p>
@@ -1776,12 +2478,18 @@
         <w:spacing w:after="60" w:line="276" w:lineRule="auto"/>
         <w:ind w:left="397" w:hanging="397"/>
         <w:jc w:val="left"/>
+        <w:rPr>
+          <w:rFonts w:hint="eastAsia" w:ascii="宋体" w:hAnsi="宋体" w:eastAsia="宋体" w:cs="宋体"/>
+          <w:sz w:val="18"/>
+          <w:szCs w:val="18"/>
+        </w:rPr>
       </w:pPr>
       <w:r>
         <w:rPr>
-          <w:rFonts w:ascii="微软雅黑" w:hAnsi="微软雅黑" w:eastAsia="微软雅黑"/>
+          <w:rFonts w:hint="eastAsia" w:ascii="宋体" w:hAnsi="宋体" w:eastAsia="宋体" w:cs="宋体"/>
           <w:color w:val="000000"/>
           <w:sz w:val="18"/>
+          <w:szCs w:val="18"/>
         </w:rPr>
         <w:t>1. Munson, D. C., O'Brien, J. D., Jenkins, W. K. A Tomographic Formulation of Spotlight-Mode Synthetic Aperture Radar. Proceedings of the IEEE, 1983, 71(8): 917-925.</w:t>
       </w:r>
@@ -1791,12 +2499,18 @@
         <w:spacing w:after="60" w:line="276" w:lineRule="auto"/>
         <w:ind w:left="397" w:hanging="397"/>
         <w:jc w:val="left"/>
+        <w:rPr>
+          <w:rFonts w:hint="eastAsia" w:ascii="宋体" w:hAnsi="宋体" w:eastAsia="宋体" w:cs="宋体"/>
+          <w:sz w:val="18"/>
+          <w:szCs w:val="18"/>
+        </w:rPr>
       </w:pPr>
       <w:r>
         <w:rPr>
-          <w:rFonts w:ascii="微软雅黑" w:hAnsi="微软雅黑" w:eastAsia="微软雅黑"/>
+          <w:rFonts w:hint="eastAsia" w:ascii="宋体" w:hAnsi="宋体" w:eastAsia="宋体" w:cs="宋体"/>
           <w:color w:val="000000"/>
           <w:sz w:val="18"/>
+          <w:szCs w:val="18"/>
         </w:rPr>
         <w:t>2. McCorkle, J. W. Focusing of Synthetic Aperture Ultra Wideband Data. IEEE International Conference on Systems Engineering, 1991: 1-5.</w:t>
       </w:r>
@@ -1806,12 +2520,18 @@
         <w:spacing w:after="60" w:line="276" w:lineRule="auto"/>
         <w:ind w:left="397" w:hanging="397"/>
         <w:jc w:val="left"/>
+        <w:rPr>
+          <w:rFonts w:hint="eastAsia" w:ascii="宋体" w:hAnsi="宋体" w:eastAsia="宋体" w:cs="宋体"/>
+          <w:sz w:val="18"/>
+          <w:szCs w:val="18"/>
+        </w:rPr>
       </w:pPr>
       <w:r>
         <w:rPr>
-          <w:rFonts w:ascii="微软雅黑" w:hAnsi="微软雅黑" w:eastAsia="微软雅黑"/>
+          <w:rFonts w:hint="eastAsia" w:ascii="宋体" w:hAnsi="宋体" w:eastAsia="宋体" w:cs="宋体"/>
           <w:color w:val="000000"/>
           <w:sz w:val="18"/>
+          <w:szCs w:val="18"/>
         </w:rPr>
         <w:t>3. Ulander, L. M. H., Hellsten, H., Stenström, G. Synthetic-Aperture Radar Processing Using Fast Factorized Back-Projection. IEEE Transactions on Aerospace and Electronic Systems, 2003, 39(3): 760-776.</w:t>
       </w:r>
@@ -1821,98 +2541,20 @@
         <w:spacing w:after="60" w:line="276" w:lineRule="auto"/>
         <w:ind w:left="397" w:hanging="397"/>
         <w:jc w:val="left"/>
+        <w:rPr>
+          <w:rFonts w:hint="eastAsia" w:ascii="宋体" w:hAnsi="宋体" w:eastAsia="宋体" w:cs="宋体"/>
+          <w:sz w:val="18"/>
+          <w:szCs w:val="18"/>
+        </w:rPr>
       </w:pPr>
       <w:r>
         <w:rPr>
-          <w:rFonts w:ascii="微软雅黑" w:hAnsi="微软雅黑" w:eastAsia="微软雅黑"/>
+          <w:rFonts w:hint="eastAsia" w:ascii="宋体" w:hAnsi="宋体" w:eastAsia="宋体" w:cs="宋体"/>
           <w:color w:val="000000"/>
           <w:sz w:val="18"/>
+          <w:szCs w:val="18"/>
         </w:rPr>
         <w:t>4. Fasih, A., Hartley, T. GPU-Accelerated Synthetic Aperture Radar Backprojection in CUDA. IEEE Radar Conference, 2010.</w:t>
-      </w:r>
-    </w:p>
-    <w:p>
-      <w:pPr>
-        <w:spacing w:after="60" w:line="276" w:lineRule="auto"/>
-        <w:ind w:left="397" w:hanging="397"/>
-        <w:jc w:val="left"/>
-      </w:pPr>
-      <w:r>
-        <w:rPr>
-          <w:rFonts w:ascii="微软雅黑" w:hAnsi="微软雅黑" w:eastAsia="微软雅黑"/>
-          <w:color w:val="000000"/>
-          <w:sz w:val="18"/>
-        </w:rPr>
-        <w:t xml:space="preserve">5. NVIDIA. MatX SAR Back Projection API. </w:t>
-      </w:r>
-      <w:r>
-        <w:fldChar w:fldCharType="begin"/>
-      </w:r>
-      <w:r>
-        <w:instrText xml:space="preserve"> HYPERLINK "https://nvidia.github.io/MatX/api/signalimage/radar/sar_bp.html" \h </w:instrText>
-      </w:r>
-      <w:r>
-        <w:fldChar w:fldCharType="separate"/>
-      </w:r>
-      <w:r>
-        <w:rPr>
-          <w:rFonts w:ascii="微软雅黑" w:hAnsi="微软雅黑" w:eastAsia="微软雅黑"/>
-          <w:color w:val="0563C1"/>
-          <w:sz w:val="18"/>
-          <w:u w:val="single"/>
-        </w:rPr>
-        <w:t>https://nvidia.github.io/MatX/api/signalimage/radar/sar_bp.html</w:t>
-      </w:r>
-      <w:r>
-        <w:rPr>
-          <w:rFonts w:ascii="微软雅黑" w:hAnsi="微软雅黑" w:eastAsia="微软雅黑"/>
-          <w:color w:val="0563C1"/>
-          <w:sz w:val="18"/>
-          <w:u w:val="single"/>
-        </w:rPr>
-        <w:fldChar w:fldCharType="end"/>
-      </w:r>
-    </w:p>
-    <w:p>
-      <w:pPr>
-        <w:spacing w:after="60" w:line="276" w:lineRule="auto"/>
-        <w:ind w:left="397" w:hanging="397"/>
-        <w:jc w:val="left"/>
-      </w:pPr>
-      <w:r>
-        <w:rPr>
-          <w:rFonts w:ascii="微软雅黑" w:hAnsi="微软雅黑" w:eastAsia="微软雅黑"/>
-          <w:color w:val="000000"/>
-          <w:sz w:val="18"/>
-        </w:rPr>
-        <w:t xml:space="preserve">6. Benson, T. GOTCHA-Back: CUDA Backprojection Implementation and SER Comparison. </w:t>
-      </w:r>
-      <w:r>
-        <w:fldChar w:fldCharType="begin"/>
-      </w:r>
-      <w:r>
-        <w:instrText xml:space="preserve"> HYPERLINK "https://github.com/tbensonatl/gotcha-back" \h </w:instrText>
-      </w:r>
-      <w:r>
-        <w:fldChar w:fldCharType="separate"/>
-      </w:r>
-      <w:r>
-        <w:rPr>
-          <w:rFonts w:ascii="微软雅黑" w:hAnsi="微软雅黑" w:eastAsia="微软雅黑"/>
-          <w:color w:val="0563C1"/>
-          <w:sz w:val="18"/>
-          <w:u w:val="single"/>
-        </w:rPr>
-        <w:t>https://github.com/tbensonatl/gotcha-back</w:t>
-      </w:r>
-      <w:r>
-        <w:rPr>
-          <w:rFonts w:ascii="微软雅黑" w:hAnsi="微软雅黑" w:eastAsia="微软雅黑"/>
-          <w:color w:val="0563C1"/>
-          <w:sz w:val="18"/>
-          <w:u w:val="single"/>
-        </w:rPr>
-        <w:fldChar w:fldCharType="end"/>
       </w:r>
     </w:p>
     <w:sectPr>
@@ -2158,7 +2800,7 @@
   <w:docDefaults>
     <w:rPrDefault>
       <w:rPr>
-        <w:rFonts w:asciiTheme="minorHAnsi" w:hAnsiTheme="minorHAnsi" w:eastAsiaTheme="minorEastAsia" w:cstheme="minorBidi"/>
+        <w:rFonts w:ascii="Times New Roman" w:hAnsi="Times New Roman" w:eastAsia="宋体" w:cs="Times New Roman"/>
       </w:rPr>
     </w:rPrDefault>
     <w:pPrDefault/>
@@ -2327,8 +2969,8 @@
     <w:lsdException w:unhideWhenUsed="0" w:uiPriority="69" w:semiHidden="0" w:name="Medium Grid 3"/>
     <w:lsdException w:unhideWhenUsed="0" w:uiPriority="70" w:semiHidden="0" w:name="Dark List"/>
     <w:lsdException w:unhideWhenUsed="0" w:uiPriority="71" w:semiHidden="0" w:name="Colorful Shading"/>
-    <w:lsdException w:unhideWhenUsed="0" w:uiPriority="72" w:semiHidden="0" w:name="Colorful List"/>
-    <w:lsdException w:unhideWhenUsed="0" w:uiPriority="73" w:semiHidden="0" w:name="Colorful Grid"/>
+    <w:lsdException w:qFormat="1" w:unhideWhenUsed="0" w:uiPriority="72" w:semiHidden="0" w:name="Colorful List"/>
+    <w:lsdException w:qFormat="1" w:unhideWhenUsed="0" w:uiPriority="73" w:semiHidden="0" w:name="Colorful Grid"/>
     <w:lsdException w:unhideWhenUsed="0" w:uiPriority="60" w:semiHidden="0" w:name="Light Shading Accent 1"/>
     <w:lsdException w:unhideWhenUsed="0" w:uiPriority="61" w:semiHidden="0" w:name="Light List Accent 1"/>
     <w:lsdException w:unhideWhenUsed="0" w:uiPriority="62" w:semiHidden="0" w:name="Light Grid Accent 1"/>
@@ -2343,9 +2985,9 @@
     <w:lsdException w:unhideWhenUsed="0" w:uiPriority="68" w:semiHidden="0" w:name="Medium Grid 2 Accent 1"/>
     <w:lsdException w:unhideWhenUsed="0" w:uiPriority="69" w:semiHidden="0" w:name="Medium Grid 3 Accent 1"/>
     <w:lsdException w:unhideWhenUsed="0" w:uiPriority="70" w:semiHidden="0" w:name="Dark List Accent 1"/>
-    <w:lsdException w:unhideWhenUsed="0" w:uiPriority="71" w:semiHidden="0" w:name="Colorful Shading Accent 1"/>
-    <w:lsdException w:unhideWhenUsed="0" w:uiPriority="72" w:semiHidden="0" w:name="Colorful List Accent 1"/>
-    <w:lsdException w:unhideWhenUsed="0" w:uiPriority="73" w:semiHidden="0" w:name="Colorful Grid Accent 1"/>
+    <w:lsdException w:qFormat="1" w:unhideWhenUsed="0" w:uiPriority="71" w:semiHidden="0" w:name="Colorful Shading Accent 1"/>
+    <w:lsdException w:qFormat="1" w:unhideWhenUsed="0" w:uiPriority="72" w:semiHidden="0" w:name="Colorful List Accent 1"/>
+    <w:lsdException w:qFormat="1" w:unhideWhenUsed="0" w:uiPriority="73" w:semiHidden="0" w:name="Colorful Grid Accent 1"/>
     <w:lsdException w:unhideWhenUsed="0" w:uiPriority="60" w:semiHidden="0" w:name="Light Shading Accent 2"/>
     <w:lsdException w:unhideWhenUsed="0" w:uiPriority="61" w:semiHidden="0" w:name="Light List Accent 2"/>
     <w:lsdException w:unhideWhenUsed="0" w:uiPriority="62" w:semiHidden="0" w:name="Light Grid Accent 2"/>
@@ -2357,9 +2999,9 @@
     <w:lsdException w:unhideWhenUsed="0" w:uiPriority="68" w:semiHidden="0" w:name="Medium Grid 2 Accent 2"/>
     <w:lsdException w:unhideWhenUsed="0" w:uiPriority="69" w:semiHidden="0" w:name="Medium Grid 3 Accent 2"/>
     <w:lsdException w:unhideWhenUsed="0" w:uiPriority="70" w:semiHidden="0" w:name="Dark List Accent 2"/>
-    <w:lsdException w:unhideWhenUsed="0" w:uiPriority="71" w:semiHidden="0" w:name="Colorful Shading Accent 2"/>
-    <w:lsdException w:unhideWhenUsed="0" w:uiPriority="72" w:semiHidden="0" w:name="Colorful List Accent 2"/>
-    <w:lsdException w:unhideWhenUsed="0" w:uiPriority="73" w:semiHidden="0" w:name="Colorful Grid Accent 2"/>
+    <w:lsdException w:qFormat="1" w:unhideWhenUsed="0" w:uiPriority="71" w:semiHidden="0" w:name="Colorful Shading Accent 2"/>
+    <w:lsdException w:qFormat="1" w:unhideWhenUsed="0" w:uiPriority="72" w:semiHidden="0" w:name="Colorful List Accent 2"/>
+    <w:lsdException w:qFormat="1" w:unhideWhenUsed="0" w:uiPriority="73" w:semiHidden="0" w:name="Colorful Grid Accent 2"/>
     <w:lsdException w:unhideWhenUsed="0" w:uiPriority="60" w:semiHidden="0" w:name="Light Shading Accent 3"/>
     <w:lsdException w:unhideWhenUsed="0" w:uiPriority="61" w:semiHidden="0" w:name="Light List Accent 3"/>
     <w:lsdException w:unhideWhenUsed="0" w:uiPriority="62" w:semiHidden="0" w:name="Light Grid Accent 3"/>
@@ -2371,9 +3013,9 @@
     <w:lsdException w:unhideWhenUsed="0" w:uiPriority="68" w:semiHidden="0" w:name="Medium Grid 2 Accent 3"/>
     <w:lsdException w:unhideWhenUsed="0" w:uiPriority="69" w:semiHidden="0" w:name="Medium Grid 3 Accent 3"/>
     <w:lsdException w:unhideWhenUsed="0" w:uiPriority="70" w:semiHidden="0" w:name="Dark List Accent 3"/>
-    <w:lsdException w:unhideWhenUsed="0" w:uiPriority="71" w:semiHidden="0" w:name="Colorful Shading Accent 3"/>
-    <w:lsdException w:unhideWhenUsed="0" w:uiPriority="72" w:semiHidden="0" w:name="Colorful List Accent 3"/>
-    <w:lsdException w:unhideWhenUsed="0" w:uiPriority="73" w:semiHidden="0" w:name="Colorful Grid Accent 3"/>
+    <w:lsdException w:qFormat="1" w:unhideWhenUsed="0" w:uiPriority="71" w:semiHidden="0" w:name="Colorful Shading Accent 3"/>
+    <w:lsdException w:qFormat="1" w:unhideWhenUsed="0" w:uiPriority="72" w:semiHidden="0" w:name="Colorful List Accent 3"/>
+    <w:lsdException w:qFormat="1" w:unhideWhenUsed="0" w:uiPriority="73" w:semiHidden="0" w:name="Colorful Grid Accent 3"/>
     <w:lsdException w:unhideWhenUsed="0" w:uiPriority="60" w:semiHidden="0" w:name="Light Shading Accent 4"/>
     <w:lsdException w:unhideWhenUsed="0" w:uiPriority="61" w:semiHidden="0" w:name="Light List Accent 4"/>
     <w:lsdException w:unhideWhenUsed="0" w:uiPriority="62" w:semiHidden="0" w:name="Light Grid Accent 4"/>
@@ -2385,9 +3027,9 @@
     <w:lsdException w:unhideWhenUsed="0" w:uiPriority="68" w:semiHidden="0" w:name="Medium Grid 2 Accent 4"/>
     <w:lsdException w:unhideWhenUsed="0" w:uiPriority="69" w:semiHidden="0" w:name="Medium Grid 3 Accent 4"/>
     <w:lsdException w:unhideWhenUsed="0" w:uiPriority="70" w:semiHidden="0" w:name="Dark List Accent 4"/>
-    <w:lsdException w:unhideWhenUsed="0" w:uiPriority="71" w:semiHidden="0" w:name="Colorful Shading Accent 4"/>
-    <w:lsdException w:unhideWhenUsed="0" w:uiPriority="72" w:semiHidden="0" w:name="Colorful List Accent 4"/>
-    <w:lsdException w:unhideWhenUsed="0" w:uiPriority="73" w:semiHidden="0" w:name="Colorful Grid Accent 4"/>
+    <w:lsdException w:qFormat="1" w:unhideWhenUsed="0" w:uiPriority="71" w:semiHidden="0" w:name="Colorful Shading Accent 4"/>
+    <w:lsdException w:qFormat="1" w:unhideWhenUsed="0" w:uiPriority="72" w:semiHidden="0" w:name="Colorful List Accent 4"/>
+    <w:lsdException w:qFormat="1" w:unhideWhenUsed="0" w:uiPriority="73" w:semiHidden="0" w:name="Colorful Grid Accent 4"/>
     <w:lsdException w:unhideWhenUsed="0" w:uiPriority="60" w:semiHidden="0" w:name="Light Shading Accent 5"/>
     <w:lsdException w:unhideWhenUsed="0" w:uiPriority="61" w:semiHidden="0" w:name="Light List Accent 5"/>
     <w:lsdException w:unhideWhenUsed="0" w:uiPriority="62" w:semiHidden="0" w:name="Light Grid Accent 5"/>
@@ -2399,9 +3041,9 @@
     <w:lsdException w:unhideWhenUsed="0" w:uiPriority="68" w:semiHidden="0" w:name="Medium Grid 2 Accent 5"/>
     <w:lsdException w:unhideWhenUsed="0" w:uiPriority="69" w:semiHidden="0" w:name="Medium Grid 3 Accent 5"/>
     <w:lsdException w:unhideWhenUsed="0" w:uiPriority="70" w:semiHidden="0" w:name="Dark List Accent 5"/>
-    <w:lsdException w:unhideWhenUsed="0" w:uiPriority="71" w:semiHidden="0" w:name="Colorful Shading Accent 5"/>
-    <w:lsdException w:unhideWhenUsed="0" w:uiPriority="72" w:semiHidden="0" w:name="Colorful List Accent 5"/>
-    <w:lsdException w:unhideWhenUsed="0" w:uiPriority="73" w:semiHidden="0" w:name="Colorful Grid Accent 5"/>
+    <w:lsdException w:qFormat="1" w:unhideWhenUsed="0" w:uiPriority="71" w:semiHidden="0" w:name="Colorful Shading Accent 5"/>
+    <w:lsdException w:qFormat="1" w:unhideWhenUsed="0" w:uiPriority="72" w:semiHidden="0" w:name="Colorful List Accent 5"/>
+    <w:lsdException w:qFormat="1" w:unhideWhenUsed="0" w:uiPriority="73" w:semiHidden="0" w:name="Colorful Grid Accent 5"/>
     <w:lsdException w:unhideWhenUsed="0" w:uiPriority="60" w:semiHidden="0" w:name="Light Shading Accent 6"/>
     <w:lsdException w:unhideWhenUsed="0" w:uiPriority="61" w:semiHidden="0" w:name="Light List Accent 6"/>
     <w:lsdException w:unhideWhenUsed="0" w:uiPriority="62" w:semiHidden="0" w:name="Light Grid Accent 6"/>
@@ -2413,9 +3055,9 @@
     <w:lsdException w:unhideWhenUsed="0" w:uiPriority="68" w:semiHidden="0" w:name="Medium Grid 2 Accent 6"/>
     <w:lsdException w:unhideWhenUsed="0" w:uiPriority="69" w:semiHidden="0" w:name="Medium Grid 3 Accent 6"/>
     <w:lsdException w:unhideWhenUsed="0" w:uiPriority="70" w:semiHidden="0" w:name="Dark List Accent 6"/>
-    <w:lsdException w:unhideWhenUsed="0" w:uiPriority="71" w:semiHidden="0" w:name="Colorful Shading Accent 6"/>
-    <w:lsdException w:unhideWhenUsed="0" w:uiPriority="72" w:semiHidden="0" w:name="Colorful List Accent 6"/>
-    <w:lsdException w:unhideWhenUsed="0" w:uiPriority="73" w:semiHidden="0" w:name="Colorful Grid Accent 6"/>
+    <w:lsdException w:qFormat="1" w:unhideWhenUsed="0" w:uiPriority="71" w:semiHidden="0" w:name="Colorful Shading Accent 6"/>
+    <w:lsdException w:qFormat="1" w:unhideWhenUsed="0" w:uiPriority="72" w:semiHidden="0" w:name="Colorful List Accent 6"/>
+    <w:lsdException w:qFormat="1" w:unhideWhenUsed="0" w:uiPriority="73" w:semiHidden="0" w:name="Colorful Grid Accent 6"/>
   </w:latentStyles>
   <w:style w:type="paragraph" w:default="1" w:styleId="1">
     <w:name w:val="Normal"/>
@@ -12224,6 +12866,7 @@
   <w:style w:type="table" w:styleId="112">
     <w:name w:val="Colorful Shading Accent 1"/>
     <w:basedOn w:val="32"/>
+    <w:qFormat/>
     <w:uiPriority w:val="71"/>
     <w:pPr>
       <w:spacing w:after="0" w:line="240" w:lineRule="auto"/>
@@ -12372,6 +13015,7 @@
   <w:style w:type="table" w:styleId="113">
     <w:name w:val="Colorful Shading Accent 2"/>
     <w:basedOn w:val="32"/>
+    <w:qFormat/>
     <w:uiPriority w:val="71"/>
     <w:pPr>
       <w:spacing w:after="0" w:line="240" w:lineRule="auto"/>
@@ -12520,6 +13164,7 @@
   <w:style w:type="table" w:styleId="114">
     <w:name w:val="Colorful Shading Accent 3"/>
     <w:basedOn w:val="32"/>
+    <w:qFormat/>
     <w:uiPriority w:val="71"/>
     <w:pPr>
       <w:spacing w:after="0" w:line="240" w:lineRule="auto"/>
@@ -12648,6 +13293,7 @@
   <w:style w:type="table" w:styleId="115">
     <w:name w:val="Colorful Shading Accent 4"/>
     <w:basedOn w:val="32"/>
+    <w:qFormat/>
     <w:uiPriority w:val="71"/>
     <w:pPr>
       <w:spacing w:after="0" w:line="240" w:lineRule="auto"/>
@@ -12796,6 +13442,7 @@
   <w:style w:type="table" w:styleId="116">
     <w:name w:val="Colorful Shading Accent 5"/>
     <w:basedOn w:val="32"/>
+    <w:qFormat/>
     <w:uiPriority w:val="71"/>
     <w:pPr>
       <w:spacing w:after="0" w:line="240" w:lineRule="auto"/>
@@ -12944,6 +13591,7 @@
   <w:style w:type="table" w:styleId="117">
     <w:name w:val="Colorful Shading Accent 6"/>
     <w:basedOn w:val="32"/>
+    <w:qFormat/>
     <w:uiPriority w:val="71"/>
     <w:pPr>
       <w:spacing w:after="0" w:line="240" w:lineRule="auto"/>
@@ -13092,6 +13740,7 @@
   <w:style w:type="table" w:styleId="118">
     <w:name w:val="Colorful List"/>
     <w:basedOn w:val="32"/>
+    <w:qFormat/>
     <w:uiPriority w:val="72"/>
     <w:pPr>
       <w:spacing w:after="0" w:line="240" w:lineRule="auto"/>
@@ -13184,6 +13833,7 @@
   <w:style w:type="table" w:styleId="119">
     <w:name w:val="Colorful List Accent 1"/>
     <w:basedOn w:val="32"/>
+    <w:qFormat/>
     <w:uiPriority w:val="72"/>
     <w:pPr>
       <w:spacing w:after="0" w:line="240" w:lineRule="auto"/>
@@ -13276,6 +13926,7 @@
   <w:style w:type="table" w:styleId="120">
     <w:name w:val="Colorful List Accent 2"/>
     <w:basedOn w:val="32"/>
+    <w:qFormat/>
     <w:uiPriority w:val="72"/>
     <w:pPr>
       <w:spacing w:after="0" w:line="240" w:lineRule="auto"/>
@@ -13368,6 +14019,7 @@
   <w:style w:type="table" w:styleId="121">
     <w:name w:val="Colorful List Accent 3"/>
     <w:basedOn w:val="32"/>
+    <w:qFormat/>
     <w:uiPriority w:val="72"/>
     <w:pPr>
       <w:spacing w:after="0" w:line="240" w:lineRule="auto"/>
@@ -13460,6 +14112,7 @@
   <w:style w:type="table" w:styleId="122">
     <w:name w:val="Colorful List Accent 4"/>
     <w:basedOn w:val="32"/>
+    <w:qFormat/>
     <w:uiPriority w:val="72"/>
     <w:pPr>
       <w:spacing w:after="0" w:line="240" w:lineRule="auto"/>
@@ -13552,6 +14205,7 @@
   <w:style w:type="table" w:styleId="123">
     <w:name w:val="Colorful List Accent 5"/>
     <w:basedOn w:val="32"/>
+    <w:qFormat/>
     <w:uiPriority w:val="72"/>
     <w:pPr>
       <w:spacing w:after="0" w:line="240" w:lineRule="auto"/>
@@ -13644,6 +14298,7 @@
   <w:style w:type="table" w:styleId="124">
     <w:name w:val="Colorful List Accent 6"/>
     <w:basedOn w:val="32"/>
+    <w:qFormat/>
     <w:uiPriority w:val="72"/>
     <w:pPr>
       <w:spacing w:after="0" w:line="240" w:lineRule="auto"/>
@@ -13736,6 +14391,7 @@
   <w:style w:type="table" w:styleId="125">
     <w:name w:val="Colorful Grid"/>
     <w:basedOn w:val="32"/>
+    <w:qFormat/>
     <w:uiPriority w:val="73"/>
     <w:pPr>
       <w:spacing w:after="0" w:line="240" w:lineRule="auto"/>
@@ -13832,6 +14488,7 @@
   <w:style w:type="table" w:styleId="126">
     <w:name w:val="Colorful Grid Accent 1"/>
     <w:basedOn w:val="32"/>
+    <w:qFormat/>
     <w:uiPriority w:val="73"/>
     <w:pPr>
       <w:spacing w:after="0" w:line="240" w:lineRule="auto"/>
@@ -13928,6 +14585,7 @@
   <w:style w:type="table" w:styleId="127">
     <w:name w:val="Colorful Grid Accent 2"/>
     <w:basedOn w:val="32"/>
+    <w:qFormat/>
     <w:uiPriority w:val="73"/>
     <w:pPr>
       <w:spacing w:after="0" w:line="240" w:lineRule="auto"/>
@@ -14024,6 +14682,7 @@
   <w:style w:type="table" w:styleId="128">
     <w:name w:val="Colorful Grid Accent 3"/>
     <w:basedOn w:val="32"/>
+    <w:qFormat/>
     <w:uiPriority w:val="73"/>
     <w:pPr>
       <w:spacing w:after="0" w:line="240" w:lineRule="auto"/>
@@ -14120,6 +14779,7 @@
   <w:style w:type="table" w:styleId="129">
     <w:name w:val="Colorful Grid Accent 4"/>
     <w:basedOn w:val="32"/>
+    <w:qFormat/>
     <w:uiPriority w:val="73"/>
     <w:pPr>
       <w:spacing w:after="0" w:line="240" w:lineRule="auto"/>
@@ -14216,6 +14876,7 @@
   <w:style w:type="table" w:styleId="130">
     <w:name w:val="Colorful Grid Accent 5"/>
     <w:basedOn w:val="32"/>
+    <w:qFormat/>
     <w:uiPriority w:val="73"/>
     <w:pPr>
       <w:spacing w:after="0" w:line="240" w:lineRule="auto"/>
@@ -14312,6 +14973,7 @@
   <w:style w:type="table" w:styleId="131">
     <w:name w:val="Colorful Grid Accent 6"/>
     <w:basedOn w:val="32"/>
+    <w:qFormat/>
     <w:uiPriority w:val="73"/>
     <w:pPr>
       <w:spacing w:after="0" w:line="240" w:lineRule="auto"/>
@@ -14429,12 +15091,14 @@
     <w:name w:val="Header Char"/>
     <w:basedOn w:val="132"/>
     <w:link w:val="25"/>
+    <w:qFormat/>
     <w:uiPriority w:val="99"/>
   </w:style>
   <w:style w:type="character" w:customStyle="1" w:styleId="136">
     <w:name w:val="Footer Char"/>
     <w:basedOn w:val="132"/>
     <w:link w:val="24"/>
+    <w:qFormat/>
     <w:uiPriority w:val="99"/>
   </w:style>
   <w:style w:type="paragraph" w:styleId="137">
@@ -14455,6 +15119,7 @@
     <w:name w:val="Heading 1 Char"/>
     <w:basedOn w:val="132"/>
     <w:link w:val="3"/>
+    <w:qFormat/>
     <w:uiPriority w:val="9"/>
     <w:rPr>
       <w:rFonts w:asciiTheme="majorHAnsi" w:hAnsiTheme="majorHAnsi" w:eastAsiaTheme="majorEastAsia" w:cstheme="majorBidi"/>
@@ -14469,6 +15134,7 @@
     <w:name w:val="Heading 2 Char"/>
     <w:basedOn w:val="132"/>
     <w:link w:val="4"/>
+    <w:qFormat/>
     <w:uiPriority w:val="9"/>
     <w:rPr>
       <w:rFonts w:asciiTheme="majorHAnsi" w:hAnsiTheme="majorHAnsi" w:eastAsiaTheme="majorEastAsia" w:cstheme="majorBidi"/>
@@ -14488,6 +15154,7 @@
     <w:name w:val="Heading 3 Char"/>
     <w:basedOn w:val="132"/>
     <w:link w:val="5"/>
+    <w:qFormat/>
     <w:uiPriority w:val="9"/>
     <w:rPr>
       <w:rFonts w:asciiTheme="majorHAnsi" w:hAnsiTheme="majorHAnsi" w:eastAsiaTheme="majorEastAsia" w:cstheme="majorBidi"/>
@@ -14505,6 +15172,7 @@
     <w:name w:val="Title Char"/>
     <w:basedOn w:val="132"/>
     <w:link w:val="31"/>
+    <w:qFormat/>
     <w:uiPriority w:val="10"/>
     <w:rPr>
       <w:rFonts w:asciiTheme="majorHAnsi" w:hAnsiTheme="majorHAnsi" w:eastAsiaTheme="majorEastAsia" w:cstheme="majorBidi"/>
@@ -14519,6 +15187,7 @@
     <w:name w:val="Subtitle Char"/>
     <w:basedOn w:val="132"/>
     <w:link w:val="26"/>
+    <w:qFormat/>
     <w:uiPriority w:val="11"/>
     <w:rPr>
       <w:rFonts w:asciiTheme="majorHAnsi" w:hAnsiTheme="majorHAnsi" w:eastAsiaTheme="majorEastAsia" w:cstheme="majorBidi"/>
@@ -14549,6 +15218,7 @@
     <w:name w:val="Body Text Char"/>
     <w:basedOn w:val="132"/>
     <w:link w:val="19"/>
+    <w:qFormat/>
     <w:uiPriority w:val="99"/>
   </w:style>
   <w:style w:type="character" w:customStyle="1" w:styleId="145">

</xml_diff>